<commit_message>
fix: complete task three result exports and review runtime
</commit_message>
<xml_diff>
--- a/deliverables/data-quality-report.docx
+++ b/deliverables/data-quality-report.docx
@@ -4,56 +4,198 @@
   <w:body>
     <w:p>
       <w:pPr>
-        <w:pStyle w:val="Title"/>
+        <w:keepNext w:val="0"/>
+        <w:spacing w:before="0" w:after="0" w:line="240" w:lineRule="auto"/>
+        <w:jc w:val="both"/>
+      </w:pPr>
+    </w:p>
+    <w:p>
+      <w:pPr>
+        <w:keepNext w:val="0"/>
+        <w:spacing w:before="0" w:after="0" w:line="240" w:lineRule="auto"/>
+        <w:jc w:val="both"/>
+      </w:pPr>
+    </w:p>
+    <w:p>
+      <w:pPr>
+        <w:keepNext w:val="0"/>
+        <w:spacing w:before="0" w:after="0" w:line="240" w:lineRule="auto"/>
+        <w:jc w:val="both"/>
+      </w:pPr>
+    </w:p>
+    <w:p>
+      <w:pPr>
+        <w:keepNext w:val="0"/>
+        <w:spacing w:before="0" w:after="0" w:line="240" w:lineRule="auto"/>
+        <w:jc w:val="both"/>
+      </w:pPr>
+    </w:p>
+    <w:p>
+      <w:pPr>
+        <w:keepNext w:val="0"/>
+        <w:spacing w:before="0" w:after="0" w:line="240" w:lineRule="auto"/>
+        <w:jc w:val="both"/>
+      </w:pPr>
+    </w:p>
+    <w:p>
+      <w:pPr>
+        <w:keepNext w:val="0"/>
+        <w:spacing w:before="0" w:after="0" w:line="240" w:lineRule="auto"/>
+        <w:jc w:val="both"/>
+      </w:pPr>
+    </w:p>
+    <w:p>
+      <w:pPr>
+        <w:keepNext w:val="0"/>
+        <w:spacing w:before="0" w:after="280" w:line="300" w:lineRule="auto"/>
+        <w:jc w:val="left"/>
+        <w:pBdr>
+          <w:bottom w:val="single" w:sz="18" w:space="8" w:color="0E3F8C"/>
+        </w:pBdr>
       </w:pPr>
       <w:r>
+        <w:rPr>
+          <w:rFonts w:ascii="Microsoft YaHei" w:hAnsi="Microsoft YaHei" w:eastAsia="Microsoft YaHei" w:cs="Microsoft YaHei"/>
+          <w:b/>
+          <w:i w:val="0"/>
+          <w:color w:val="0E3F8C"/>
+          <w:sz w:val="48"/>
+        </w:rPr>
         <w:t>招采公告与附件数据质量分析报告</w:t>
       </w:r>
     </w:p>
     <w:p>
       <w:pPr>
-        <w:pStyle w:val="Subtitle"/>
+        <w:keepNext w:val="0"/>
+        <w:spacing w:before="120" w:after="0" w:line="288" w:lineRule="auto"/>
+        <w:jc w:val="left"/>
       </w:pPr>
       <w:r>
-        <w:t>初赛过程性文档 · 2026-10-11 · 版本 1.0</w:t>
+        <w:rPr>
+          <w:rFonts w:ascii="Microsoft YaHei" w:hAnsi="Microsoft YaHei" w:eastAsia="Microsoft YaHei" w:cs="Microsoft YaHei"/>
+          <w:b w:val="0"/>
+          <w:i w:val="0"/>
+          <w:color w:val="4A5568"/>
+          <w:sz w:val="22"/>
+        </w:rPr>
+        <w:t xml:space="preserve">初赛过程性文档   |   2026-10-14   |   版本 1.1</w:t>
       </w:r>
     </w:p>
     <w:p>
       <w:pPr>
-        <w:pStyle w:val="Heading1"/>
+        <w:keepNext w:val="0"/>
+        <w:spacing w:before="40" w:after="0" w:line="288" w:lineRule="auto"/>
+        <w:jc w:val="left"/>
       </w:pPr>
       <w:r>
-        <w:t>1 数据范围与质量结论</w:t>
+        <w:rPr>
+          <w:rFonts w:ascii="Microsoft YaHei" w:hAnsi="Microsoft YaHei" w:eastAsia="Microsoft YaHei" w:cs="Microsoft YaHei"/>
+          <w:b w:val="0"/>
+          <w:i w:val="0"/>
+          <w:color w:val="8B97A8"/>
+          <w:sz w:val="20"/>
+        </w:rPr>
+        <w:t>数据质量分析报告</w:t>
       </w:r>
     </w:p>
     <w:p>
       <w:r>
-        <w:t>系统已对 1,038 条采购公告及其附件完成本地处理与分类盘点，能够对复杂格式、失败附件、参考材料和无效下载响应保留来源并隔离处理。数据治理重点是让可用内容继续进入抽取流程，让异常内容可解释、可追溯，不让单个坏附件中断整批任务。</w:t>
-      </w:r>
-    </w:p>
-    <w:p>
-      <w:r>
-        <w:t>本报告数量对应 2026-09-30 的全量历史快照，不表示当前代码重新处理后的结果。解析覆盖、字段抽取正确性和查询实现一致性是不同指标；解析产生文本不能直接视作七字段正确。</w:t>
+        <w:br w:type="page"/>
       </w:r>
     </w:p>
     <w:p>
       <w:pPr>
-        <w:pStyle w:val="Heading1"/>
+        <w:keepNext/>
+        <w:spacing w:before="300" w:after="140" w:line="288" w:lineRule="auto"/>
+        <w:jc w:val="left"/>
       </w:pPr>
       <w:r>
-        <w:t>2 全量附件快照</w:t>
+        <w:rPr>
+          <w:rFonts w:ascii="Microsoft YaHei" w:hAnsi="Microsoft YaHei" w:eastAsia="Microsoft YaHei" w:cs="Microsoft YaHei"/>
+          <w:b/>
+          <w:i w:val="0"/>
+          <w:color w:val="0E3F8C"/>
+          <w:sz w:val="27"/>
+        </w:rPr>
+        <w:t xml:space="preserve">1 数据范围与质量结论</w:t>
+      </w:r>
+    </w:p>
+    <w:p>
+      <w:pPr>
+        <w:keepNext w:val="0"/>
+        <w:spacing w:before="0" w:after="140" w:line="360" w:lineRule="auto"/>
+        <w:jc w:val="both"/>
+      </w:pPr>
+      <w:r>
+        <w:rPr>
+          <w:rFonts w:ascii="Microsoft YaHei" w:hAnsi="Microsoft YaHei" w:eastAsia="Microsoft YaHei" w:cs="Microsoft YaHei"/>
+          <w:b w:val="0"/>
+          <w:i w:val="0"/>
+          <w:color w:val="1A2230"/>
+          <w:sz w:val="21"/>
+        </w:rPr>
+        <w:t xml:space="preserve">系统已对 1,038 条采购公告及其附件完成本地处理与分类盘点，能够对复杂格式、失败附件、参考材料和无效下载响应保留来源并隔离处理。数据治理重点是让可用内容继续进入抽取流程，让异常内容可解释、可追溯，不让单个坏附件中断整批任务。</w:t>
+      </w:r>
+    </w:p>
+    <w:p>
+      <w:pPr>
+        <w:keepNext w:val="0"/>
+        <w:spacing w:before="0" w:after="140" w:line="360" w:lineRule="auto"/>
+        <w:jc w:val="both"/>
+      </w:pPr>
+      <w:r>
+        <w:rPr>
+          <w:rFonts w:ascii="Microsoft YaHei" w:hAnsi="Microsoft YaHei" w:eastAsia="Microsoft YaHei" w:cs="Microsoft YaHei"/>
+          <w:b w:val="0"/>
+          <w:i w:val="0"/>
+          <w:color w:val="1A2230"/>
+          <w:sz w:val="21"/>
+        </w:rPr>
+        <w:t xml:space="preserve">本报告同时记录 2026-09-30 的附件快照和 2026-10-14 的官方结果补录复核。解析覆盖、字段抽取正确性和查询实现一致性是不同指标；解析产生文本不能直接视作七字段正确。</w:t>
+      </w:r>
+    </w:p>
+    <w:p>
+      <w:pPr>
+        <w:keepNext/>
+        <w:spacing w:before="300" w:after="140" w:line="288" w:lineRule="auto"/>
+        <w:jc w:val="left"/>
+      </w:pPr>
+      <w:r>
+        <w:rPr>
+          <w:rFonts w:ascii="Microsoft YaHei" w:hAnsi="Microsoft YaHei" w:eastAsia="Microsoft YaHei" w:cs="Microsoft YaHei"/>
+          <w:b/>
+          <w:i w:val="0"/>
+          <w:color w:val="0E3F8C"/>
+          <w:sz w:val="27"/>
+        </w:rPr>
+        <w:t xml:space="preserve">2 全量附件快照</w:t>
       </w:r>
     </w:p>
     <w:tbl>
       <w:tblPr>
         <w:tblW w:type="auto" w:w="0"/>
-        <w:tblLayout w:type="fixed"/>
+        <w:jc w:val="center"/>
+        <w:tblLayout w:type="autofit"/>
         <w:tblLook w:firstColumn="1" w:firstRow="1" w:lastColumn="0" w:lastRow="0" w:noHBand="0" w:noVBand="1" w:val="04A0"/>
+        <w:tblBorders>
+          <w:top w:val="single" w:sz="14" w:space="0" w:color="0E3F8C"/>
+          <w:bottom w:val="single" w:sz="14" w:space="0" w:color="0E3F8C"/>
+          <w:insideH w:val="single" w:sz="4" w:space="0" w:color="D6DCE5"/>
+          <w:left w:val="none" w:sz="0" w:space="0"/>
+          <w:right w:val="none" w:sz="0" w:space="0"/>
+          <w:insideV w:val="none" w:sz="0" w:space="0"/>
+        </w:tblBorders>
+        <w:tblCellMar>
+          <w:top w:w="60" w:type="dxa"/>
+          <w:left w:w="110" w:type="dxa"/>
+          <w:bottom w:w="60" w:type="dxa"/>
+          <w:right w:w="110" w:type="dxa"/>
+        </w:tblCellMar>
       </w:tblPr>
       <w:tblGrid>
-        <w:gridCol w:w="2891"/>
-        <w:gridCol w:w="1134"/>
-        <w:gridCol w:w="5613"/>
+        <w:gridCol w:w="2986"/>
+        <w:gridCol w:w="2986"/>
+        <w:gridCol w:w="2986"/>
       </w:tblGrid>
       <w:tr>
         <w:trPr>
@@ -62,76 +204,58 @@
         </w:trPr>
         <w:tc>
           <w:tcPr>
-            <w:tcW w:type="dxa" w:w="2891"/>
-            <w:shd w:fill="EAF0F5"/>
-            <w:tcMar>
-              <w:top w:w="85" w:type="dxa"/>
-              <w:left w:w="85" w:type="dxa"/>
-              <w:bottom w:w="85" w:type="dxa"/>
-              <w:right w:w="85" w:type="dxa"/>
-            </w:tcMar>
+            <w:tcW w:type="dxa" w:w="2986"/>
+            <w:shd w:val="clear" w:color="auto" w:fill="E8EFF8"/>
+            <w:tcBorders>
+              <w:bottom w:val="single" w:sz="10" w:color="0E3F8C"/>
+            </w:tcBorders>
           </w:tcPr>
           <w:p>
             <w:pPr>
-              <w:spacing w:after="60" w:before="60" w:line="252" w:lineRule="auto"/>
+              <w:keepNext w:val="0"/>
+              <w:spacing w:before="0" w:after="0" w:line="276" w:lineRule="auto"/>
+              <w:jc w:val="left"/>
             </w:pPr>
             <w:r>
-              <w:rPr>
-                <w:b/>
-                <w:color w:val="183B56"/>
-                <w:sz w:val="18"/>
-              </w:rPr>
-              <w:t>统计项</w:t>
+              <w:t xml:space="preserve">统计项</w:t>
             </w:r>
           </w:p>
         </w:tc>
         <w:tc>
           <w:tcPr>
-            <w:tcW w:type="dxa" w:w="1134"/>
-            <w:shd w:fill="EAF0F5"/>
-            <w:tcMar>
-              <w:top w:w="85" w:type="dxa"/>
-              <w:left w:w="85" w:type="dxa"/>
-              <w:bottom w:w="85" w:type="dxa"/>
-              <w:right w:w="85" w:type="dxa"/>
-            </w:tcMar>
+            <w:tcW w:type="dxa" w:w="2986"/>
+            <w:shd w:val="clear" w:color="auto" w:fill="E8EFF8"/>
+            <w:tcBorders>
+              <w:bottom w:val="single" w:sz="10" w:color="0E3F8C"/>
+            </w:tcBorders>
           </w:tcPr>
           <w:p>
             <w:pPr>
-              <w:spacing w:after="60" w:before="60" w:line="252" w:lineRule="auto"/>
+              <w:keepNext w:val="0"/>
+              <w:spacing w:before="0" w:after="0" w:line="276" w:lineRule="auto"/>
+              <w:jc w:val="left"/>
             </w:pPr>
             <w:r>
-              <w:rPr>
-                <w:b/>
-                <w:color w:val="183B56"/>
-                <w:sz w:val="18"/>
-              </w:rPr>
-              <w:t>数量</w:t>
+              <w:t xml:space="preserve">数量</w:t>
             </w:r>
           </w:p>
         </w:tc>
         <w:tc>
           <w:tcPr>
-            <w:tcW w:type="dxa" w:w="5613"/>
-            <w:shd w:fill="EAF0F5"/>
-            <w:tcMar>
-              <w:top w:w="85" w:type="dxa"/>
-              <w:left w:w="85" w:type="dxa"/>
-              <w:bottom w:w="85" w:type="dxa"/>
-              <w:right w:w="85" w:type="dxa"/>
-            </w:tcMar>
+            <w:tcW w:type="dxa" w:w="2986"/>
+            <w:shd w:val="clear" w:color="auto" w:fill="E8EFF8"/>
+            <w:tcBorders>
+              <w:bottom w:val="single" w:sz="10" w:color="0E3F8C"/>
+            </w:tcBorders>
           </w:tcPr>
           <w:p>
             <w:pPr>
-              <w:spacing w:after="60" w:before="60" w:line="252" w:lineRule="auto"/>
+              <w:keepNext w:val="0"/>
+              <w:spacing w:before="0" w:after="0" w:line="276" w:lineRule="auto"/>
+              <w:jc w:val="left"/>
             </w:pPr>
             <w:r>
-              <w:rPr>
-                <w:b/>
-                <w:color w:val="183B56"/>
-                <w:sz w:val="18"/>
-              </w:rPr>
-              <w:t>含义</w:t>
+              <w:t xml:space="preserve">含义</w:t>
             </w:r>
           </w:p>
         </w:tc>
@@ -142,70 +266,46 @@
         </w:trPr>
         <w:tc>
           <w:tcPr>
-            <w:tcW w:type="dxa" w:w="2891"/>
-            <w:shd w:fill="FFFFFF"/>
-            <w:tcMar>
-              <w:top w:w="85" w:type="dxa"/>
-              <w:left w:w="85" w:type="dxa"/>
-              <w:bottom w:w="85" w:type="dxa"/>
-              <w:right w:w="85" w:type="dxa"/>
-            </w:tcMar>
+            <w:tcW w:type="dxa" w:w="2986"/>
           </w:tcPr>
           <w:p>
             <w:pPr>
-              <w:spacing w:after="60" w:before="60" w:line="252" w:lineRule="auto"/>
+              <w:keepNext w:val="0"/>
+              <w:spacing w:before="0" w:after="0" w:line="276" w:lineRule="auto"/>
+              <w:jc w:val="left"/>
             </w:pPr>
             <w:r>
-              <w:rPr>
-                <w:sz w:val="18"/>
-              </w:rPr>
-              <w:t>公告</w:t>
+              <w:t xml:space="preserve">公告</w:t>
             </w:r>
           </w:p>
         </w:tc>
         <w:tc>
           <w:tcPr>
-            <w:tcW w:type="dxa" w:w="1134"/>
-            <w:shd w:fill="FFFFFF"/>
-            <w:tcMar>
-              <w:top w:w="85" w:type="dxa"/>
-              <w:left w:w="85" w:type="dxa"/>
-              <w:bottom w:w="85" w:type="dxa"/>
-              <w:right w:w="85" w:type="dxa"/>
-            </w:tcMar>
+            <w:tcW w:type="dxa" w:w="2986"/>
           </w:tcPr>
           <w:p>
             <w:pPr>
-              <w:spacing w:after="60" w:before="60" w:line="252" w:lineRule="auto"/>
+              <w:keepNext w:val="0"/>
+              <w:spacing w:before="0" w:after="0" w:line="276" w:lineRule="auto"/>
+              <w:jc w:val="right"/>
             </w:pPr>
             <w:r>
-              <w:rPr>
-                <w:sz w:val="18"/>
-              </w:rPr>
-              <w:t>1,038</w:t>
+              <w:t xml:space="preserve">1,038</w:t>
             </w:r>
           </w:p>
         </w:tc>
         <w:tc>
           <w:tcPr>
-            <w:tcW w:type="dxa" w:w="5613"/>
-            <w:shd w:fill="FFFFFF"/>
-            <w:tcMar>
-              <w:top w:w="85" w:type="dxa"/>
-              <w:left w:w="85" w:type="dxa"/>
-              <w:bottom w:w="85" w:type="dxa"/>
-              <w:right w:w="85" w:type="dxa"/>
-            </w:tcMar>
+            <w:tcW w:type="dxa" w:w="2986"/>
           </w:tcPr>
           <w:p>
             <w:pPr>
-              <w:spacing w:after="60" w:before="60" w:line="252" w:lineRule="auto"/>
+              <w:keepNext w:val="0"/>
+              <w:spacing w:before="0" w:after="0" w:line="276" w:lineRule="auto"/>
+              <w:jc w:val="left"/>
             </w:pPr>
             <w:r>
-              <w:rPr>
-                <w:sz w:val="18"/>
-              </w:rPr>
-              <w:t>全量材料快照的公告数</w:t>
+              <w:t xml:space="preserve">全量材料快照的公告数</w:t>
             </w:r>
           </w:p>
         </w:tc>
@@ -216,70 +316,46 @@
         </w:trPr>
         <w:tc>
           <w:tcPr>
-            <w:tcW w:type="dxa" w:w="2891"/>
-            <w:shd w:fill="F7F9FB"/>
-            <w:tcMar>
-              <w:top w:w="85" w:type="dxa"/>
-              <w:left w:w="85" w:type="dxa"/>
-              <w:bottom w:w="85" w:type="dxa"/>
-              <w:right w:w="85" w:type="dxa"/>
-            </w:tcMar>
+            <w:tcW w:type="dxa" w:w="2986"/>
           </w:tcPr>
           <w:p>
             <w:pPr>
-              <w:spacing w:after="60" w:before="60" w:line="252" w:lineRule="auto"/>
+              <w:keepNext w:val="0"/>
+              <w:spacing w:before="0" w:after="0" w:line="276" w:lineRule="auto"/>
+              <w:jc w:val="left"/>
             </w:pPr>
             <w:r>
-              <w:rPr>
-                <w:sz w:val="18"/>
-              </w:rPr>
-              <w:t>附件叶文件</w:t>
+              <w:t xml:space="preserve">附件叶文件</w:t>
             </w:r>
           </w:p>
         </w:tc>
         <w:tc>
           <w:tcPr>
-            <w:tcW w:type="dxa" w:w="1134"/>
-            <w:shd w:fill="F7F9FB"/>
-            <w:tcMar>
-              <w:top w:w="85" w:type="dxa"/>
-              <w:left w:w="85" w:type="dxa"/>
-              <w:bottom w:w="85" w:type="dxa"/>
-              <w:right w:w="85" w:type="dxa"/>
-            </w:tcMar>
+            <w:tcW w:type="dxa" w:w="2986"/>
           </w:tcPr>
           <w:p>
             <w:pPr>
-              <w:spacing w:after="60" w:before="60" w:line="252" w:lineRule="auto"/>
+              <w:keepNext w:val="0"/>
+              <w:spacing w:before="0" w:after="0" w:line="276" w:lineRule="auto"/>
+              <w:jc w:val="right"/>
             </w:pPr>
             <w:r>
-              <w:rPr>
-                <w:sz w:val="18"/>
-              </w:rPr>
-              <w:t>13,136</w:t>
+              <w:t xml:space="preserve">13,136</w:t>
             </w:r>
           </w:p>
         </w:tc>
         <w:tc>
           <w:tcPr>
-            <w:tcW w:type="dxa" w:w="5613"/>
-            <w:shd w:fill="F7F9FB"/>
-            <w:tcMar>
-              <w:top w:w="85" w:type="dxa"/>
-              <w:left w:w="85" w:type="dxa"/>
-              <w:bottom w:w="85" w:type="dxa"/>
-              <w:right w:w="85" w:type="dxa"/>
-            </w:tcMar>
+            <w:tcW w:type="dxa" w:w="2986"/>
           </w:tcPr>
           <w:p>
             <w:pPr>
-              <w:spacing w:after="60" w:before="60" w:line="252" w:lineRule="auto"/>
+              <w:keepNext w:val="0"/>
+              <w:spacing w:before="0" w:after="0" w:line="276" w:lineRule="auto"/>
+              <w:jc w:val="left"/>
             </w:pPr>
             <w:r>
-              <w:rPr>
-                <w:sz w:val="18"/>
-              </w:rPr>
-              <w:t>展开后文件，不含公告 HTML</w:t>
+              <w:t xml:space="preserve">展开后文件，不含公告 HTML</w:t>
             </w:r>
           </w:p>
         </w:tc>
@@ -290,70 +366,46 @@
         </w:trPr>
         <w:tc>
           <w:tcPr>
-            <w:tcW w:type="dxa" w:w="2891"/>
-            <w:shd w:fill="FFFFFF"/>
-            <w:tcMar>
-              <w:top w:w="85" w:type="dxa"/>
-              <w:left w:w="85" w:type="dxa"/>
-              <w:bottom w:w="85" w:type="dxa"/>
-              <w:right w:w="85" w:type="dxa"/>
-            </w:tcMar>
+            <w:tcW w:type="dxa" w:w="2986"/>
           </w:tcPr>
           <w:p>
             <w:pPr>
-              <w:spacing w:after="60" w:before="60" w:line="252" w:lineRule="auto"/>
+              <w:keepNext w:val="0"/>
+              <w:spacing w:before="0" w:after="0" w:line="276" w:lineRule="auto"/>
+              <w:jc w:val="left"/>
             </w:pPr>
             <w:r>
-              <w:rPr>
-                <w:sz w:val="18"/>
-              </w:rPr>
-              <w:t>成功或部分解析</w:t>
+              <w:t xml:space="preserve">成功或部分解析</w:t>
             </w:r>
           </w:p>
         </w:tc>
         <w:tc>
           <w:tcPr>
-            <w:tcW w:type="dxa" w:w="1134"/>
-            <w:shd w:fill="FFFFFF"/>
-            <w:tcMar>
-              <w:top w:w="85" w:type="dxa"/>
-              <w:left w:w="85" w:type="dxa"/>
-              <w:bottom w:w="85" w:type="dxa"/>
-              <w:right w:w="85" w:type="dxa"/>
-            </w:tcMar>
+            <w:tcW w:type="dxa" w:w="2986"/>
           </w:tcPr>
           <w:p>
             <w:pPr>
-              <w:spacing w:after="60" w:before="60" w:line="252" w:lineRule="auto"/>
+              <w:keepNext w:val="0"/>
+              <w:spacing w:before="0" w:after="0" w:line="276" w:lineRule="auto"/>
+              <w:jc w:val="right"/>
             </w:pPr>
             <w:r>
-              <w:rPr>
-                <w:sz w:val="18"/>
-              </w:rPr>
-              <w:t>12,124</w:t>
+              <w:t xml:space="preserve">12,124</w:t>
             </w:r>
           </w:p>
         </w:tc>
         <w:tc>
           <w:tcPr>
-            <w:tcW w:type="dxa" w:w="5613"/>
-            <w:shd w:fill="FFFFFF"/>
-            <w:tcMar>
-              <w:top w:w="85" w:type="dxa"/>
-              <w:left w:w="85" w:type="dxa"/>
-              <w:bottom w:w="85" w:type="dxa"/>
-              <w:right w:w="85" w:type="dxa"/>
-            </w:tcMar>
+            <w:tcW w:type="dxa" w:w="2986"/>
           </w:tcPr>
           <w:p>
             <w:pPr>
-              <w:spacing w:after="60" w:before="60" w:line="252" w:lineRule="auto"/>
+              <w:keepNext w:val="0"/>
+              <w:spacing w:before="0" w:after="0" w:line="276" w:lineRule="auto"/>
+              <w:jc w:val="left"/>
             </w:pPr>
             <w:r>
-              <w:rPr>
-                <w:sz w:val="18"/>
-              </w:rPr>
-              <w:t>获得文本、OCR 或表格结果</w:t>
+              <w:t xml:space="preserve">获得文本、OCR 或表格结果</w:t>
             </w:r>
           </w:p>
         </w:tc>
@@ -364,70 +416,46 @@
         </w:trPr>
         <w:tc>
           <w:tcPr>
-            <w:tcW w:type="dxa" w:w="2891"/>
-            <w:shd w:fill="F7F9FB"/>
-            <w:tcMar>
-              <w:top w:w="85" w:type="dxa"/>
-              <w:left w:w="85" w:type="dxa"/>
-              <w:bottom w:w="85" w:type="dxa"/>
-              <w:right w:w="85" w:type="dxa"/>
-            </w:tcMar>
+            <w:tcW w:type="dxa" w:w="2986"/>
           </w:tcPr>
           <w:p>
             <w:pPr>
-              <w:spacing w:after="60" w:before="60" w:line="252" w:lineRule="auto"/>
+              <w:keepNext w:val="0"/>
+              <w:spacing w:before="0" w:after="0" w:line="276" w:lineRule="auto"/>
+              <w:jc w:val="left"/>
             </w:pPr>
             <w:r>
-              <w:rPr>
-                <w:sz w:val="18"/>
-              </w:rPr>
-              <w:t>参考材料保留但不解析</w:t>
+              <w:t xml:space="preserve">参考材料保留但不解析</w:t>
             </w:r>
           </w:p>
         </w:tc>
         <w:tc>
           <w:tcPr>
-            <w:tcW w:type="dxa" w:w="1134"/>
-            <w:shd w:fill="F7F9FB"/>
-            <w:tcMar>
-              <w:top w:w="85" w:type="dxa"/>
-              <w:left w:w="85" w:type="dxa"/>
-              <w:bottom w:w="85" w:type="dxa"/>
-              <w:right w:w="85" w:type="dxa"/>
-            </w:tcMar>
+            <w:tcW w:type="dxa" w:w="2986"/>
           </w:tcPr>
           <w:p>
             <w:pPr>
-              <w:spacing w:after="60" w:before="60" w:line="252" w:lineRule="auto"/>
+              <w:keepNext w:val="0"/>
+              <w:spacing w:before="0" w:after="0" w:line="276" w:lineRule="auto"/>
+              <w:jc w:val="right"/>
             </w:pPr>
             <w:r>
-              <w:rPr>
-                <w:sz w:val="18"/>
-              </w:rPr>
-              <w:t>986</w:t>
+              <w:t xml:space="preserve">986</w:t>
             </w:r>
           </w:p>
         </w:tc>
         <w:tc>
           <w:tcPr>
-            <w:tcW w:type="dxa" w:w="5613"/>
-            <w:shd w:fill="F7F9FB"/>
-            <w:tcMar>
-              <w:top w:w="85" w:type="dxa"/>
-              <w:left w:w="85" w:type="dxa"/>
-              <w:bottom w:w="85" w:type="dxa"/>
-              <w:right w:w="85" w:type="dxa"/>
-            </w:tcMar>
+            <w:tcW w:type="dxa" w:w="2986"/>
           </w:tcPr>
           <w:p>
             <w:pPr>
-              <w:spacing w:after="60" w:before="60" w:line="252" w:lineRule="auto"/>
+              <w:keepNext w:val="0"/>
+              <w:spacing w:before="0" w:after="0" w:line="276" w:lineRule="auto"/>
+              <w:jc w:val="left"/>
             </w:pPr>
             <w:r>
-              <w:rPr>
-                <w:sz w:val="18"/>
-              </w:rPr>
-              <w:t>按用途识别，保留来源</w:t>
+              <w:t xml:space="preserve">按用途识别，保留来源</w:t>
             </w:r>
           </w:p>
         </w:tc>
@@ -438,70 +466,46 @@
         </w:trPr>
         <w:tc>
           <w:tcPr>
-            <w:tcW w:type="dxa" w:w="2891"/>
-            <w:shd w:fill="FFFFFF"/>
-            <w:tcMar>
-              <w:top w:w="85" w:type="dxa"/>
-              <w:left w:w="85" w:type="dxa"/>
-              <w:bottom w:w="85" w:type="dxa"/>
-              <w:right w:w="85" w:type="dxa"/>
-            </w:tcMar>
+            <w:tcW w:type="dxa" w:w="2986"/>
           </w:tcPr>
           <w:p>
             <w:pPr>
-              <w:spacing w:after="60" w:before="60" w:line="252" w:lineRule="auto"/>
+              <w:keepNext w:val="0"/>
+              <w:spacing w:before="0" w:after="0" w:line="276" w:lineRule="auto"/>
+              <w:jc w:val="left"/>
             </w:pPr>
             <w:r>
-              <w:rPr>
-                <w:sz w:val="18"/>
-              </w:rPr>
-              <w:t>程序解析失败</w:t>
+              <w:t xml:space="preserve">程序解析失败</w:t>
             </w:r>
           </w:p>
         </w:tc>
         <w:tc>
           <w:tcPr>
-            <w:tcW w:type="dxa" w:w="1134"/>
-            <w:shd w:fill="FFFFFF"/>
-            <w:tcMar>
-              <w:top w:w="85" w:type="dxa"/>
-              <w:left w:w="85" w:type="dxa"/>
-              <w:bottom w:w="85" w:type="dxa"/>
-              <w:right w:w="85" w:type="dxa"/>
-            </w:tcMar>
+            <w:tcW w:type="dxa" w:w="2986"/>
           </w:tcPr>
           <w:p>
             <w:pPr>
-              <w:spacing w:after="60" w:before="60" w:line="252" w:lineRule="auto"/>
+              <w:keepNext w:val="0"/>
+              <w:spacing w:before="0" w:after="0" w:line="276" w:lineRule="auto"/>
+              <w:jc w:val="right"/>
             </w:pPr>
             <w:r>
-              <w:rPr>
-                <w:sz w:val="18"/>
-              </w:rPr>
-              <w:t>19</w:t>
+              <w:t xml:space="preserve">19</w:t>
             </w:r>
           </w:p>
         </w:tc>
         <w:tc>
           <w:tcPr>
-            <w:tcW w:type="dxa" w:w="5613"/>
-            <w:shd w:fill="FFFFFF"/>
-            <w:tcMar>
-              <w:top w:w="85" w:type="dxa"/>
-              <w:left w:w="85" w:type="dxa"/>
-              <w:bottom w:w="85" w:type="dxa"/>
-              <w:right w:w="85" w:type="dxa"/>
-            </w:tcMar>
+            <w:tcW w:type="dxa" w:w="2986"/>
           </w:tcPr>
           <w:p>
             <w:pPr>
-              <w:spacing w:after="60" w:before="60" w:line="252" w:lineRule="auto"/>
+              <w:keepNext w:val="0"/>
+              <w:spacing w:before="0" w:after="0" w:line="276" w:lineRule="auto"/>
+              <w:jc w:val="left"/>
             </w:pPr>
             <w:r>
-              <w:rPr>
-                <w:sz w:val="18"/>
-              </w:rPr>
-              <w:t>17 PDF、2 DOC，按附件隔离</w:t>
+              <w:t xml:space="preserve">17 PDF、2 DOC，按附件隔离</w:t>
             </w:r>
           </w:p>
         </w:tc>
@@ -512,70 +516,46 @@
         </w:trPr>
         <w:tc>
           <w:tcPr>
-            <w:tcW w:type="dxa" w:w="2891"/>
-            <w:shd w:fill="F7F9FB"/>
-            <w:tcMar>
-              <w:top w:w="85" w:type="dxa"/>
-              <w:left w:w="85" w:type="dxa"/>
-              <w:bottom w:w="85" w:type="dxa"/>
-              <w:right w:w="85" w:type="dxa"/>
-            </w:tcMar>
+            <w:tcW w:type="dxa" w:w="2986"/>
           </w:tcPr>
           <w:p>
             <w:pPr>
-              <w:spacing w:after="60" w:before="60" w:line="252" w:lineRule="auto"/>
+              <w:keepNext w:val="0"/>
+              <w:spacing w:before="0" w:after="0" w:line="276" w:lineRule="auto"/>
+              <w:jc w:val="left"/>
             </w:pPr>
             <w:r>
-              <w:rPr>
-                <w:sz w:val="18"/>
-              </w:rPr>
-              <w:t>不支持格式</w:t>
+              <w:t xml:space="preserve">不支持格式</w:t>
             </w:r>
           </w:p>
         </w:tc>
         <w:tc>
           <w:tcPr>
-            <w:tcW w:type="dxa" w:w="1134"/>
-            <w:shd w:fill="F7F9FB"/>
-            <w:tcMar>
-              <w:top w:w="85" w:type="dxa"/>
-              <w:left w:w="85" w:type="dxa"/>
-              <w:bottom w:w="85" w:type="dxa"/>
-              <w:right w:w="85" w:type="dxa"/>
-            </w:tcMar>
+            <w:tcW w:type="dxa" w:w="2986"/>
           </w:tcPr>
           <w:p>
             <w:pPr>
-              <w:spacing w:after="60" w:before="60" w:line="252" w:lineRule="auto"/>
+              <w:keepNext w:val="0"/>
+              <w:spacing w:before="0" w:after="0" w:line="276" w:lineRule="auto"/>
+              <w:jc w:val="right"/>
             </w:pPr>
             <w:r>
-              <w:rPr>
-                <w:sz w:val="18"/>
-              </w:rPr>
-              <w:t>7</w:t>
+              <w:t xml:space="preserve">7</w:t>
             </w:r>
           </w:p>
         </w:tc>
         <w:tc>
           <w:tcPr>
-            <w:tcW w:type="dxa" w:w="5613"/>
-            <w:shd w:fill="F7F9FB"/>
-            <w:tcMar>
-              <w:top w:w="85" w:type="dxa"/>
-              <w:left w:w="85" w:type="dxa"/>
-              <w:bottom w:w="85" w:type="dxa"/>
-              <w:right w:w="85" w:type="dxa"/>
-            </w:tcMar>
+            <w:tcW w:type="dxa" w:w="2986"/>
           </w:tcPr>
           <w:p>
             <w:pPr>
-              <w:spacing w:after="60" w:before="60" w:line="252" w:lineRule="auto"/>
+              <w:keepNext w:val="0"/>
+              <w:spacing w:before="0" w:after="0" w:line="276" w:lineRule="auto"/>
+              <w:jc w:val="left"/>
             </w:pPr>
             <w:r>
-              <w:rPr>
-                <w:sz w:val="18"/>
-              </w:rPr>
-              <w:t>6 DWG、1 GBQ7，保留来源与告警</w:t>
+              <w:t xml:space="preserve">6 DWG、1 GBQ7，保留来源与告警</w:t>
             </w:r>
           </w:p>
         </w:tc>
@@ -586,70 +566,46 @@
         </w:trPr>
         <w:tc>
           <w:tcPr>
-            <w:tcW w:type="dxa" w:w="2891"/>
-            <w:shd w:fill="FFFFFF"/>
-            <w:tcMar>
-              <w:top w:w="85" w:type="dxa"/>
-              <w:left w:w="85" w:type="dxa"/>
-              <w:bottom w:w="85" w:type="dxa"/>
-              <w:right w:w="85" w:type="dxa"/>
-            </w:tcMar>
+            <w:tcW w:type="dxa" w:w="2986"/>
           </w:tcPr>
           <w:p>
             <w:pPr>
-              <w:spacing w:after="60" w:before="60" w:line="252" w:lineRule="auto"/>
+              <w:keepNext w:val="0"/>
+              <w:spacing w:before="0" w:after="0" w:line="276" w:lineRule="auto"/>
+              <w:jc w:val="left"/>
             </w:pPr>
             <w:r>
-              <w:rPr>
-                <w:sz w:val="18"/>
-              </w:rPr>
-              <w:t>无效下载响应</w:t>
+              <w:t xml:space="preserve">无效下载响应</w:t>
             </w:r>
           </w:p>
         </w:tc>
         <w:tc>
           <w:tcPr>
-            <w:tcW w:type="dxa" w:w="1134"/>
-            <w:shd w:fill="FFFFFF"/>
-            <w:tcMar>
-              <w:top w:w="85" w:type="dxa"/>
-              <w:left w:w="85" w:type="dxa"/>
-              <w:bottom w:w="85" w:type="dxa"/>
-              <w:right w:w="85" w:type="dxa"/>
-            </w:tcMar>
+            <w:tcW w:type="dxa" w:w="2986"/>
           </w:tcPr>
           <w:p>
             <w:pPr>
-              <w:spacing w:after="60" w:before="60" w:line="252" w:lineRule="auto"/>
+              <w:keepNext w:val="0"/>
+              <w:spacing w:before="0" w:after="0" w:line="276" w:lineRule="auto"/>
+              <w:jc w:val="right"/>
             </w:pPr>
             <w:r>
-              <w:rPr>
-                <w:sz w:val="18"/>
-              </w:rPr>
-              <w:t>87</w:t>
+              <w:t xml:space="preserve">87</w:t>
             </w:r>
           </w:p>
         </w:tc>
         <w:tc>
           <w:tcPr>
-            <w:tcW w:type="dxa" w:w="5613"/>
-            <w:shd w:fill="FFFFFF"/>
-            <w:tcMar>
-              <w:top w:w="85" w:type="dxa"/>
-              <w:left w:w="85" w:type="dxa"/>
-              <w:bottom w:w="85" w:type="dxa"/>
-              <w:right w:w="85" w:type="dxa"/>
-            </w:tcMar>
+            <w:tcW w:type="dxa" w:w="2986"/>
           </w:tcPr>
           <w:p>
             <w:pPr>
-              <w:spacing w:after="60" w:before="60" w:line="252" w:lineRule="auto"/>
+              <w:keepNext w:val="0"/>
+              <w:spacing w:before="0" w:after="0" w:line="276" w:lineRule="auto"/>
+              <w:jc w:val="left"/>
             </w:pPr>
             <w:r>
-              <w:rPr>
-                <w:sz w:val="18"/>
-              </w:rPr>
-              <w:t>进入解析前排除，另行统计</w:t>
+              <w:t xml:space="preserve">进入解析前排除，另行统计</w:t>
             </w:r>
           </w:p>
         </w:tc>
@@ -660,70 +616,46 @@
         </w:trPr>
         <w:tc>
           <w:tcPr>
-            <w:tcW w:type="dxa" w:w="2891"/>
-            <w:shd w:fill="F7F9FB"/>
-            <w:tcMar>
-              <w:top w:w="85" w:type="dxa"/>
-              <w:left w:w="85" w:type="dxa"/>
-              <w:bottom w:w="85" w:type="dxa"/>
-              <w:right w:w="85" w:type="dxa"/>
-            </w:tcMar>
+            <w:tcW w:type="dxa" w:w="2986"/>
           </w:tcPr>
           <w:p>
             <w:pPr>
-              <w:spacing w:after="60" w:before="60" w:line="252" w:lineRule="auto"/>
+              <w:keepNext w:val="0"/>
+              <w:spacing w:before="0" w:after="0" w:line="276" w:lineRule="auto"/>
+              <w:jc w:val="left"/>
             </w:pPr>
             <w:r>
-              <w:rPr>
-                <w:sz w:val="18"/>
-              </w:rPr>
-              <w:t>有 OCR 告警的公告</w:t>
+              <w:t xml:space="preserve">有 OCR 告警的公告</w:t>
             </w:r>
           </w:p>
         </w:tc>
         <w:tc>
           <w:tcPr>
-            <w:tcW w:type="dxa" w:w="1134"/>
-            <w:shd w:fill="F7F9FB"/>
-            <w:tcMar>
-              <w:top w:w="85" w:type="dxa"/>
-              <w:left w:w="85" w:type="dxa"/>
-              <w:bottom w:w="85" w:type="dxa"/>
-              <w:right w:w="85" w:type="dxa"/>
-            </w:tcMar>
+            <w:tcW w:type="dxa" w:w="2986"/>
           </w:tcPr>
           <w:p>
             <w:pPr>
-              <w:spacing w:after="60" w:before="60" w:line="252" w:lineRule="auto"/>
+              <w:keepNext w:val="0"/>
+              <w:spacing w:before="0" w:after="0" w:line="276" w:lineRule="auto"/>
+              <w:jc w:val="right"/>
             </w:pPr>
             <w:r>
-              <w:rPr>
-                <w:sz w:val="18"/>
-              </w:rPr>
-              <w:t>359</w:t>
+              <w:t xml:space="preserve">359</w:t>
             </w:r>
           </w:p>
         </w:tc>
         <w:tc>
           <w:tcPr>
-            <w:tcW w:type="dxa" w:w="5613"/>
-            <w:shd w:fill="F7F9FB"/>
-            <w:tcMar>
-              <w:top w:w="85" w:type="dxa"/>
-              <w:left w:w="85" w:type="dxa"/>
-              <w:bottom w:w="85" w:type="dxa"/>
-              <w:right w:w="85" w:type="dxa"/>
-            </w:tcMar>
+            <w:tcW w:type="dxa" w:w="2986"/>
           </w:tcPr>
           <w:p>
             <w:pPr>
-              <w:spacing w:after="60" w:before="60" w:line="252" w:lineRule="auto"/>
+              <w:keepNext w:val="0"/>
+              <w:spacing w:before="0" w:after="0" w:line="276" w:lineRule="auto"/>
+              <w:jc w:val="left"/>
             </w:pPr>
             <w:r>
-              <w:rPr>
-                <w:sz w:val="18"/>
-              </w:rPr>
-              <w:t>涉及 OCR 路径，不代表识别正确</w:t>
+              <w:t xml:space="preserve">涉及 OCR 路径，不代表识别正确</w:t>
             </w:r>
           </w:p>
         </w:tc>
@@ -731,37 +663,70 @@
     </w:tbl>
     <w:p>
       <w:pPr>
-        <w:spacing w:after="20"/>
+        <w:keepNext w:val="0"/>
+        <w:spacing w:before="0" w:after="0" w:line="240" w:lineRule="auto"/>
+        <w:jc w:val="both"/>
       </w:pPr>
     </w:p>
     <w:p>
+      <w:pPr>
+        <w:keepNext w:val="0"/>
+        <w:spacing w:before="0" w:after="140" w:line="360" w:lineRule="auto"/>
+        <w:jc w:val="both"/>
+      </w:pPr>
       <w:r>
-        <w:t>附件叶文件分类满足 12,124 + 986 + 19 + 7 = 13,136。87 个无效下载响应在解析前被识别，因此不再计入该分类总和。快照与分类详情见 docs/benchmarks/official-attachments-20260930.json。</w:t>
-      </w:r>
-    </w:p>
-    <w:p>
-      <w:r>
-        <w:br w:type="page"/>
+        <w:rPr>
+          <w:rFonts w:ascii="Microsoft YaHei" w:hAnsi="Microsoft YaHei" w:eastAsia="Microsoft YaHei" w:cs="Microsoft YaHei"/>
+          <w:b w:val="0"/>
+          <w:i w:val="0"/>
+          <w:color w:val="1A2230"/>
+          <w:sz w:val="21"/>
+        </w:rPr>
+        <w:t xml:space="preserve">附件叶文件分类满足 12,124 + 986 + 19 + 7 = 13,136。87 个无效下载响应在解析前被识别，因此不再计入该分类总和。快照与分类详情见 docs/benchmarks/official-attachments-20260930.json。</w:t>
       </w:r>
     </w:p>
     <w:p>
       <w:pPr>
-        <w:pStyle w:val="Heading1"/>
+        <w:keepNext/>
+        <w:spacing w:before="300" w:after="140" w:line="288" w:lineRule="auto"/>
+        <w:jc w:val="left"/>
       </w:pPr>
       <w:r>
-        <w:t>3 质量控制方法</w:t>
+        <w:rPr>
+          <w:rFonts w:ascii="Microsoft YaHei" w:hAnsi="Microsoft YaHei" w:eastAsia="Microsoft YaHei" w:cs="Microsoft YaHei"/>
+          <w:b/>
+          <w:i w:val="0"/>
+          <w:color w:val="0E3F8C"/>
+          <w:sz w:val="27"/>
+        </w:rPr>
+        <w:t xml:space="preserve">3 质量控制方法</w:t>
       </w:r>
     </w:p>
     <w:tbl>
       <w:tblPr>
         <w:tblW w:type="auto" w:w="0"/>
-        <w:tblLayout w:type="fixed"/>
+        <w:jc w:val="center"/>
+        <w:tblLayout w:type="autofit"/>
         <w:tblLook w:firstColumn="1" w:firstRow="1" w:lastColumn="0" w:lastRow="0" w:noHBand="0" w:noVBand="1" w:val="04A0"/>
+        <w:tblBorders>
+          <w:top w:val="single" w:sz="14" w:space="0" w:color="0E3F8C"/>
+          <w:bottom w:val="single" w:sz="14" w:space="0" w:color="0E3F8C"/>
+          <w:insideH w:val="single" w:sz="4" w:space="0" w:color="D6DCE5"/>
+          <w:left w:val="none" w:sz="0" w:space="0"/>
+          <w:right w:val="none" w:sz="0" w:space="0"/>
+          <w:insideV w:val="none" w:sz="0" w:space="0"/>
+        </w:tblBorders>
+        <w:tblCellMar>
+          <w:top w:w="60" w:type="dxa"/>
+          <w:left w:w="110" w:type="dxa"/>
+          <w:bottom w:w="60" w:type="dxa"/>
+          <w:right w:w="110" w:type="dxa"/>
+        </w:tblCellMar>
       </w:tblPr>
       <w:tblGrid>
-        <w:gridCol w:w="1928"/>
-        <w:gridCol w:w="2381"/>
-        <w:gridCol w:w="5329"/>
+        <w:gridCol w:w="2986"/>
+        <w:gridCol w:w="2986"/>
+        <w:gridCol w:w="2986"/>
       </w:tblGrid>
       <w:tr>
         <w:trPr>
@@ -770,76 +735,58 @@
         </w:trPr>
         <w:tc>
           <w:tcPr>
-            <w:tcW w:type="dxa" w:w="1928"/>
-            <w:shd w:fill="EAF0F5"/>
-            <w:tcMar>
-              <w:top w:w="85" w:type="dxa"/>
-              <w:left w:w="85" w:type="dxa"/>
-              <w:bottom w:w="85" w:type="dxa"/>
-              <w:right w:w="85" w:type="dxa"/>
-            </w:tcMar>
+            <w:tcW w:type="dxa" w:w="2986"/>
+            <w:shd w:val="clear" w:color="auto" w:fill="E8EFF8"/>
+            <w:tcBorders>
+              <w:bottom w:val="single" w:sz="10" w:color="0E3F8C"/>
+            </w:tcBorders>
           </w:tcPr>
           <w:p>
             <w:pPr>
-              <w:spacing w:after="60" w:before="60" w:line="252" w:lineRule="auto"/>
+              <w:keepNext w:val="0"/>
+              <w:spacing w:before="0" w:after="0" w:line="276" w:lineRule="auto"/>
+              <w:jc w:val="left"/>
             </w:pPr>
             <w:r>
-              <w:rPr>
-                <w:b/>
-                <w:color w:val="183B56"/>
-                <w:sz w:val="18"/>
-              </w:rPr>
-              <w:t>环节</w:t>
+              <w:t xml:space="preserve">环节</w:t>
             </w:r>
           </w:p>
         </w:tc>
         <w:tc>
           <w:tcPr>
-            <w:tcW w:type="dxa" w:w="2381"/>
-            <w:shd w:fill="EAF0F5"/>
-            <w:tcMar>
-              <w:top w:w="85" w:type="dxa"/>
-              <w:left w:w="85" w:type="dxa"/>
-              <w:bottom w:w="85" w:type="dxa"/>
-              <w:right w:w="85" w:type="dxa"/>
-            </w:tcMar>
+            <w:tcW w:type="dxa" w:w="2986"/>
+            <w:shd w:val="clear" w:color="auto" w:fill="E8EFF8"/>
+            <w:tcBorders>
+              <w:bottom w:val="single" w:sz="10" w:color="0E3F8C"/>
+            </w:tcBorders>
           </w:tcPr>
           <w:p>
             <w:pPr>
-              <w:spacing w:after="60" w:before="60" w:line="252" w:lineRule="auto"/>
+              <w:keepNext w:val="0"/>
+              <w:spacing w:before="0" w:after="0" w:line="276" w:lineRule="auto"/>
+              <w:jc w:val="left"/>
             </w:pPr>
             <w:r>
-              <w:rPr>
-                <w:b/>
-                <w:color w:val="183B56"/>
-                <w:sz w:val="18"/>
-              </w:rPr>
-              <w:t>控制措施</w:t>
+              <w:t xml:space="preserve">控制措施</w:t>
             </w:r>
           </w:p>
         </w:tc>
         <w:tc>
           <w:tcPr>
-            <w:tcW w:type="dxa" w:w="5329"/>
-            <w:shd w:fill="EAF0F5"/>
-            <w:tcMar>
-              <w:top w:w="85" w:type="dxa"/>
-              <w:left w:w="85" w:type="dxa"/>
-              <w:bottom w:w="85" w:type="dxa"/>
-              <w:right w:w="85" w:type="dxa"/>
-            </w:tcMar>
+            <w:tcW w:type="dxa" w:w="2986"/>
+            <w:shd w:val="clear" w:color="auto" w:fill="E8EFF8"/>
+            <w:tcBorders>
+              <w:bottom w:val="single" w:sz="10" w:color="0E3F8C"/>
+            </w:tcBorders>
           </w:tcPr>
           <w:p>
             <w:pPr>
-              <w:spacing w:after="60" w:before="60" w:line="252" w:lineRule="auto"/>
+              <w:keepNext w:val="0"/>
+              <w:spacing w:before="0" w:after="0" w:line="276" w:lineRule="auto"/>
+              <w:jc w:val="left"/>
             </w:pPr>
             <w:r>
-              <w:rPr>
-                <w:b/>
-                <w:color w:val="183B56"/>
-                <w:sz w:val="18"/>
-              </w:rPr>
-              <w:t>输出给用户的信息</w:t>
+              <w:t xml:space="preserve">输出给用户的信息</w:t>
             </w:r>
           </w:p>
         </w:tc>
@@ -850,70 +797,46 @@
         </w:trPr>
         <w:tc>
           <w:tcPr>
-            <w:tcW w:type="dxa" w:w="1928"/>
-            <w:shd w:fill="FFFFFF"/>
-            <w:tcMar>
-              <w:top w:w="85" w:type="dxa"/>
-              <w:left w:w="85" w:type="dxa"/>
-              <w:bottom w:w="85" w:type="dxa"/>
-              <w:right w:w="85" w:type="dxa"/>
-            </w:tcMar>
+            <w:tcW w:type="dxa" w:w="2986"/>
           </w:tcPr>
           <w:p>
             <w:pPr>
-              <w:spacing w:after="60" w:before="60" w:line="252" w:lineRule="auto"/>
+              <w:keepNext w:val="0"/>
+              <w:spacing w:before="0" w:after="0" w:line="276" w:lineRule="auto"/>
+              <w:jc w:val="left"/>
             </w:pPr>
             <w:r>
-              <w:rPr>
-                <w:sz w:val="18"/>
-              </w:rPr>
-              <w:t>内容识别</w:t>
+              <w:t xml:space="preserve">内容识别</w:t>
             </w:r>
           </w:p>
         </w:tc>
         <w:tc>
           <w:tcPr>
-            <w:tcW w:type="dxa" w:w="2381"/>
-            <w:shd w:fill="FFFFFF"/>
-            <w:tcMar>
-              <w:top w:w="85" w:type="dxa"/>
-              <w:left w:w="85" w:type="dxa"/>
-              <w:bottom w:w="85" w:type="dxa"/>
-              <w:right w:w="85" w:type="dxa"/>
-            </w:tcMar>
+            <w:tcW w:type="dxa" w:w="2986"/>
           </w:tcPr>
           <w:p>
             <w:pPr>
-              <w:spacing w:after="60" w:before="60" w:line="252" w:lineRule="auto"/>
+              <w:keepNext w:val="0"/>
+              <w:spacing w:before="0" w:after="0" w:line="276" w:lineRule="auto"/>
+              <w:jc w:val="left"/>
             </w:pPr>
             <w:r>
-              <w:rPr>
-                <w:sz w:val="18"/>
-              </w:rPr>
-              <w:t>比对实际内容与扩展名；识别旧式 Office、WPS 和专有格式</w:t>
+              <w:t xml:space="preserve">比对实际内容与扩展名；识别旧式 Office、WPS 和专有格式</w:t>
             </w:r>
           </w:p>
         </w:tc>
         <w:tc>
           <w:tcPr>
-            <w:tcW w:type="dxa" w:w="5329"/>
-            <w:shd w:fill="FFFFFF"/>
-            <w:tcMar>
-              <w:top w:w="85" w:type="dxa"/>
-              <w:left w:w="85" w:type="dxa"/>
-              <w:bottom w:w="85" w:type="dxa"/>
-              <w:right w:w="85" w:type="dxa"/>
-            </w:tcMar>
+            <w:tcW w:type="dxa" w:w="2986"/>
           </w:tcPr>
           <w:p>
             <w:pPr>
-              <w:spacing w:after="60" w:before="60" w:line="252" w:lineRule="auto"/>
+              <w:keepNext w:val="0"/>
+              <w:spacing w:before="0" w:after="0" w:line="276" w:lineRule="auto"/>
+              <w:jc w:val="left"/>
             </w:pPr>
             <w:r>
-              <w:rPr>
-                <w:sz w:val="18"/>
-              </w:rPr>
-              <w:t>实际格式、来源和格式差异告警</w:t>
+              <w:t xml:space="preserve">实际格式、来源和格式差异告警</w:t>
             </w:r>
           </w:p>
         </w:tc>
@@ -924,70 +847,46 @@
         </w:trPr>
         <w:tc>
           <w:tcPr>
-            <w:tcW w:type="dxa" w:w="1928"/>
-            <w:shd w:fill="F7F9FB"/>
-            <w:tcMar>
-              <w:top w:w="85" w:type="dxa"/>
-              <w:left w:w="85" w:type="dxa"/>
-              <w:bottom w:w="85" w:type="dxa"/>
-              <w:right w:w="85" w:type="dxa"/>
-            </w:tcMar>
+            <w:tcW w:type="dxa" w:w="2986"/>
           </w:tcPr>
           <w:p>
             <w:pPr>
-              <w:spacing w:after="60" w:before="60" w:line="252" w:lineRule="auto"/>
+              <w:keepNext w:val="0"/>
+              <w:spacing w:before="0" w:after="0" w:line="276" w:lineRule="auto"/>
+              <w:jc w:val="left"/>
             </w:pPr>
             <w:r>
-              <w:rPr>
-                <w:sz w:val="18"/>
-              </w:rPr>
-              <w:t>归档展开</w:t>
+              <w:t xml:space="preserve">归档展开</w:t>
             </w:r>
           </w:p>
         </w:tc>
         <w:tc>
           <w:tcPr>
-            <w:tcW w:type="dxa" w:w="2381"/>
-            <w:shd w:fill="F7F9FB"/>
-            <w:tcMar>
-              <w:top w:w="85" w:type="dxa"/>
-              <w:left w:w="85" w:type="dxa"/>
-              <w:bottom w:w="85" w:type="dxa"/>
-              <w:right w:w="85" w:type="dxa"/>
-            </w:tcMar>
+            <w:tcW w:type="dxa" w:w="2986"/>
           </w:tcPr>
           <w:p>
             <w:pPr>
-              <w:spacing w:after="60" w:before="60" w:line="252" w:lineRule="auto"/>
+              <w:keepNext w:val="0"/>
+              <w:spacing w:before="0" w:after="0" w:line="276" w:lineRule="auto"/>
+              <w:jc w:val="left"/>
             </w:pPr>
             <w:r>
-              <w:rPr>
-                <w:sz w:val="18"/>
-              </w:rPr>
-              <w:t>限制深度、成员数和大小；损坏成员独立隔离</w:t>
+              <w:t xml:space="preserve">限制深度、成员数和大小；损坏成员独立隔离</w:t>
             </w:r>
           </w:p>
         </w:tc>
         <w:tc>
           <w:tcPr>
-            <w:tcW w:type="dxa" w:w="5329"/>
-            <w:shd w:fill="F7F9FB"/>
-            <w:tcMar>
-              <w:top w:w="85" w:type="dxa"/>
-              <w:left w:w="85" w:type="dxa"/>
-              <w:bottom w:w="85" w:type="dxa"/>
-              <w:right w:w="85" w:type="dxa"/>
-            </w:tcMar>
+            <w:tcW w:type="dxa" w:w="2986"/>
           </w:tcPr>
           <w:p>
             <w:pPr>
-              <w:spacing w:after="60" w:before="60" w:line="252" w:lineRule="auto"/>
+              <w:keepNext w:val="0"/>
+              <w:spacing w:before="0" w:after="0" w:line="276" w:lineRule="auto"/>
+              <w:jc w:val="left"/>
             </w:pPr>
             <w:r>
-              <w:rPr>
-                <w:sz w:val="18"/>
-              </w:rPr>
-              <w:t>成员读取失败、超限和路径来源</w:t>
+              <w:t xml:space="preserve">成员读取失败、超限和路径来源</w:t>
             </w:r>
           </w:p>
         </w:tc>
@@ -998,70 +897,46 @@
         </w:trPr>
         <w:tc>
           <w:tcPr>
-            <w:tcW w:type="dxa" w:w="1928"/>
-            <w:shd w:fill="FFFFFF"/>
-            <w:tcMar>
-              <w:top w:w="85" w:type="dxa"/>
-              <w:left w:w="85" w:type="dxa"/>
-              <w:bottom w:w="85" w:type="dxa"/>
-              <w:right w:w="85" w:type="dxa"/>
-            </w:tcMar>
+            <w:tcW w:type="dxa" w:w="2986"/>
           </w:tcPr>
           <w:p>
             <w:pPr>
-              <w:spacing w:after="60" w:before="60" w:line="252" w:lineRule="auto"/>
+              <w:keepNext w:val="0"/>
+              <w:spacing w:before="0" w:after="0" w:line="276" w:lineRule="auto"/>
+              <w:jc w:val="left"/>
             </w:pPr>
             <w:r>
-              <w:rPr>
-                <w:sz w:val="18"/>
-              </w:rPr>
-              <w:t>文档解析</w:t>
+              <w:t xml:space="preserve">文档解析</w:t>
             </w:r>
           </w:p>
         </w:tc>
         <w:tc>
           <w:tcPr>
-            <w:tcW w:type="dxa" w:w="2381"/>
-            <w:shd w:fill="FFFFFF"/>
-            <w:tcMar>
-              <w:top w:w="85" w:type="dxa"/>
-              <w:left w:w="85" w:type="dxa"/>
-              <w:bottom w:w="85" w:type="dxa"/>
-              <w:right w:w="85" w:type="dxa"/>
-            </w:tcMar>
+            <w:tcW w:type="dxa" w:w="2986"/>
           </w:tcPr>
           <w:p>
             <w:pPr>
-              <w:spacing w:after="60" w:before="60" w:line="252" w:lineRule="auto"/>
+              <w:keepNext w:val="0"/>
+              <w:spacing w:before="0" w:after="0" w:line="276" w:lineRule="auto"/>
+              <w:jc w:val="left"/>
             </w:pPr>
             <w:r>
-              <w:rPr>
-                <w:sz w:val="18"/>
-              </w:rPr>
-              <w:t>PDF 主解析器与回退、Office 转换、OCR</w:t>
+              <w:t xml:space="preserve">PDF 主解析器与回退、Office 转换、OCR</w:t>
             </w:r>
           </w:p>
         </w:tc>
         <w:tc>
           <w:tcPr>
-            <w:tcW w:type="dxa" w:w="5329"/>
-            <w:shd w:fill="FFFFFF"/>
-            <w:tcMar>
-              <w:top w:w="85" w:type="dxa"/>
-              <w:left w:w="85" w:type="dxa"/>
-              <w:bottom w:w="85" w:type="dxa"/>
-              <w:right w:w="85" w:type="dxa"/>
-            </w:tcMar>
+            <w:tcW w:type="dxa" w:w="2986"/>
           </w:tcPr>
           <w:p>
             <w:pPr>
-              <w:spacing w:after="60" w:before="60" w:line="252" w:lineRule="auto"/>
+              <w:keepNext w:val="0"/>
+              <w:spacing w:before="0" w:after="0" w:line="276" w:lineRule="auto"/>
+              <w:jc w:val="left"/>
             </w:pPr>
             <w:r>
-              <w:rPr>
-                <w:sz w:val="18"/>
-              </w:rPr>
-              <w:t>成功、部分成功、程序失败和 OCR 状态</w:t>
+              <w:t xml:space="preserve">成功、部分成功、程序失败和 OCR 状态</w:t>
             </w:r>
           </w:p>
         </w:tc>
@@ -1072,70 +947,46 @@
         </w:trPr>
         <w:tc>
           <w:tcPr>
-            <w:tcW w:type="dxa" w:w="1928"/>
-            <w:shd w:fill="F7F9FB"/>
-            <w:tcMar>
-              <w:top w:w="85" w:type="dxa"/>
-              <w:left w:w="85" w:type="dxa"/>
-              <w:bottom w:w="85" w:type="dxa"/>
-              <w:right w:w="85" w:type="dxa"/>
-            </w:tcMar>
+            <w:tcW w:type="dxa" w:w="2986"/>
           </w:tcPr>
           <w:p>
             <w:pPr>
-              <w:spacing w:after="60" w:before="60" w:line="252" w:lineRule="auto"/>
+              <w:keepNext w:val="0"/>
+              <w:spacing w:before="0" w:after="0" w:line="276" w:lineRule="auto"/>
+              <w:jc w:val="left"/>
             </w:pPr>
             <w:r>
-              <w:rPr>
-                <w:sz w:val="18"/>
-              </w:rPr>
-              <w:t>材料用途</w:t>
+              <w:t xml:space="preserve">材料用途</w:t>
             </w:r>
           </w:p>
         </w:tc>
         <w:tc>
           <w:tcPr>
-            <w:tcW w:type="dxa" w:w="2381"/>
-            <w:shd w:fill="F7F9FB"/>
-            <w:tcMar>
-              <w:top w:w="85" w:type="dxa"/>
-              <w:left w:w="85" w:type="dxa"/>
-              <w:bottom w:w="85" w:type="dxa"/>
-              <w:right w:w="85" w:type="dxa"/>
-            </w:tcMar>
+            <w:tcW w:type="dxa" w:w="2986"/>
           </w:tcPr>
           <w:p>
             <w:pPr>
-              <w:spacing w:after="60" w:before="60" w:line="252" w:lineRule="auto"/>
+              <w:keepNext w:val="0"/>
+              <w:spacing w:before="0" w:after="0" w:line="276" w:lineRule="auto"/>
+              <w:jc w:val="left"/>
             </w:pPr>
             <w:r>
-              <w:rPr>
-                <w:sz w:val="18"/>
-              </w:rPr>
-              <w:t>区分本次采购、历史案例、合同范本和参考材料</w:t>
+              <w:t xml:space="preserve">区分本次采购、历史案例、合同范本和参考材料</w:t>
             </w:r>
           </w:p>
         </w:tc>
         <w:tc>
           <w:tcPr>
-            <w:tcW w:type="dxa" w:w="5329"/>
-            <w:shd w:fill="F7F9FB"/>
-            <w:tcMar>
-              <w:top w:w="85" w:type="dxa"/>
-              <w:left w:w="85" w:type="dxa"/>
-              <w:bottom w:w="85" w:type="dxa"/>
-              <w:right w:w="85" w:type="dxa"/>
-            </w:tcMar>
+            <w:tcW w:type="dxa" w:w="2986"/>
           </w:tcPr>
           <w:p>
             <w:pPr>
-              <w:spacing w:after="60" w:before="60" w:line="252" w:lineRule="auto"/>
+              <w:keepNext w:val="0"/>
+              <w:spacing w:before="0" w:after="0" w:line="276" w:lineRule="auto"/>
+              <w:jc w:val="left"/>
             </w:pPr>
             <w:r>
-              <w:rPr>
-                <w:sz w:val="18"/>
-              </w:rPr>
-              <w:t>用途判断、过滤理由和保留来源</w:t>
+              <w:t xml:space="preserve">用途判断、过滤理由和保留来源</w:t>
             </w:r>
           </w:p>
         </w:tc>
@@ -1146,70 +997,46 @@
         </w:trPr>
         <w:tc>
           <w:tcPr>
-            <w:tcW w:type="dxa" w:w="1928"/>
-            <w:shd w:fill="FFFFFF"/>
-            <w:tcMar>
-              <w:top w:w="85" w:type="dxa"/>
-              <w:left w:w="85" w:type="dxa"/>
-              <w:bottom w:w="85" w:type="dxa"/>
-              <w:right w:w="85" w:type="dxa"/>
-            </w:tcMar>
+            <w:tcW w:type="dxa" w:w="2986"/>
           </w:tcPr>
           <w:p>
             <w:pPr>
-              <w:spacing w:after="60" w:before="60" w:line="252" w:lineRule="auto"/>
+              <w:keepNext w:val="0"/>
+              <w:spacing w:before="0" w:after="0" w:line="276" w:lineRule="auto"/>
+              <w:jc w:val="left"/>
             </w:pPr>
             <w:r>
-              <w:rPr>
-                <w:sz w:val="18"/>
-              </w:rPr>
-              <w:t>候选抽取</w:t>
+              <w:t xml:space="preserve">候选抽取</w:t>
             </w:r>
           </w:p>
         </w:tc>
         <w:tc>
           <w:tcPr>
-            <w:tcW w:type="dxa" w:w="2381"/>
-            <w:shd w:fill="FFFFFF"/>
-            <w:tcMar>
-              <w:top w:w="85" w:type="dxa"/>
-              <w:left w:w="85" w:type="dxa"/>
-              <w:bottom w:w="85" w:type="dxa"/>
-              <w:right w:w="85" w:type="dxa"/>
-            </w:tcMar>
+            <w:tcW w:type="dxa" w:w="2986"/>
           </w:tcPr>
           <w:p>
             <w:pPr>
-              <w:spacing w:after="60" w:before="60" w:line="252" w:lineRule="auto"/>
+              <w:keepNext w:val="0"/>
+              <w:spacing w:before="0" w:after="0" w:line="276" w:lineRule="auto"/>
+              <w:jc w:val="left"/>
             </w:pPr>
             <w:r>
-              <w:rPr>
-                <w:sz w:val="18"/>
-              </w:rPr>
-              <w:t>schema、数值、包号证据和跨文件对齐保护</w:t>
+              <w:t xml:space="preserve">schema、数值、包号证据和跨文件对齐保护</w:t>
             </w:r>
           </w:p>
         </w:tc>
         <w:tc>
           <w:tcPr>
-            <w:tcW w:type="dxa" w:w="5329"/>
-            <w:shd w:fill="FFFFFF"/>
-            <w:tcMar>
-              <w:top w:w="85" w:type="dxa"/>
-              <w:left w:w="85" w:type="dxa"/>
-              <w:bottom w:w="85" w:type="dxa"/>
-              <w:right w:w="85" w:type="dxa"/>
-            </w:tcMar>
+            <w:tcW w:type="dxa" w:w="2986"/>
           </w:tcPr>
           <w:p>
             <w:pPr>
-              <w:spacing w:after="60" w:before="60" w:line="252" w:lineRule="auto"/>
+              <w:keepNext w:val="0"/>
+              <w:spacing w:before="0" w:after="0" w:line="276" w:lineRule="auto"/>
+              <w:jc w:val="left"/>
             </w:pPr>
             <w:r>
-              <w:rPr>
-                <w:sz w:val="18"/>
-              </w:rPr>
-              <w:t>字段、连续证据、冲突和 default 警告</w:t>
+              <w:t xml:space="preserve">字段、连续证据、冲突和 default 警告</w:t>
             </w:r>
           </w:p>
         </w:tc>
@@ -1220,70 +1047,46 @@
         </w:trPr>
         <w:tc>
           <w:tcPr>
-            <w:tcW w:type="dxa" w:w="1928"/>
-            <w:shd w:fill="F7F9FB"/>
-            <w:tcMar>
-              <w:top w:w="85" w:type="dxa"/>
-              <w:left w:w="85" w:type="dxa"/>
-              <w:bottom w:w="85" w:type="dxa"/>
-              <w:right w:w="85" w:type="dxa"/>
-            </w:tcMar>
+            <w:tcW w:type="dxa" w:w="2986"/>
           </w:tcPr>
           <w:p>
             <w:pPr>
-              <w:spacing w:after="60" w:before="60" w:line="252" w:lineRule="auto"/>
+              <w:keepNext w:val="0"/>
+              <w:spacing w:before="0" w:after="0" w:line="276" w:lineRule="auto"/>
+              <w:jc w:val="left"/>
             </w:pPr>
             <w:r>
-              <w:rPr>
-                <w:sz w:val="18"/>
-              </w:rPr>
-              <w:t>人工复核</w:t>
+              <w:t xml:space="preserve">人工复核</w:t>
             </w:r>
           </w:p>
         </w:tc>
         <w:tc>
           <w:tcPr>
-            <w:tcW w:type="dxa" w:w="2381"/>
-            <w:shd w:fill="F7F9FB"/>
-            <w:tcMar>
-              <w:top w:w="85" w:type="dxa"/>
-              <w:left w:w="85" w:type="dxa"/>
-              <w:bottom w:w="85" w:type="dxa"/>
-              <w:right w:w="85" w:type="dxa"/>
-            </w:tcMar>
+            <w:tcW w:type="dxa" w:w="2986"/>
           </w:tcPr>
           <w:p>
             <w:pPr>
-              <w:spacing w:after="60" w:before="60" w:line="252" w:lineRule="auto"/>
+              <w:keepNext w:val="0"/>
+              <w:spacing w:before="0" w:after="0" w:line="276" w:lineRule="auto"/>
+              <w:jc w:val="left"/>
             </w:pPr>
             <w:r>
-              <w:rPr>
-                <w:sz w:val="18"/>
-              </w:rPr>
-              <w:t>按质量信号排序，保留决定及前后值</w:t>
+              <w:t xml:space="preserve">按质量信号排序，保留决定及前后值</w:t>
             </w:r>
           </w:p>
         </w:tc>
         <w:tc>
           <w:tcPr>
-            <w:tcW w:type="dxa" w:w="5329"/>
-            <w:shd w:fill="F7F9FB"/>
-            <w:tcMar>
-              <w:top w:w="85" w:type="dxa"/>
-              <w:left w:w="85" w:type="dxa"/>
-              <w:bottom w:w="85" w:type="dxa"/>
-              <w:right w:w="85" w:type="dxa"/>
-            </w:tcMar>
+            <w:tcW w:type="dxa" w:w="2986"/>
           </w:tcPr>
           <w:p>
             <w:pPr>
-              <w:spacing w:after="60" w:before="60" w:line="252" w:lineRule="auto"/>
+              <w:keepNext w:val="0"/>
+              <w:spacing w:before="0" w:after="0" w:line="276" w:lineRule="auto"/>
+              <w:jc w:val="left"/>
             </w:pPr>
             <w:r>
-              <w:rPr>
-                <w:sz w:val="18"/>
-              </w:rPr>
-              <w:t>接受、修正、驳回和事件历史</w:t>
+              <w:t xml:space="preserve">接受、修正、驳回和事件历史</w:t>
             </w:r>
           </w:p>
         </w:tc>
@@ -1291,100 +1094,1235 @@
     </w:tbl>
     <w:p>
       <w:pPr>
-        <w:spacing w:after="20"/>
+        <w:keepNext w:val="0"/>
+        <w:spacing w:before="0" w:after="0" w:line="240" w:lineRule="auto"/>
+        <w:jc w:val="both"/>
       </w:pPr>
     </w:p>
     <w:p>
+      <w:pPr>
+        <w:keepNext w:val="0"/>
+        <w:spacing w:before="0" w:after="140" w:line="360" w:lineRule="auto"/>
+        <w:jc w:val="both"/>
+      </w:pPr>
       <w:r>
-        <w:t>WPS 进入旧 Word 转换路径；GBQ7 和 DWG 明确保留为不支持格式。无效响应、不可恢复源文件和不支持内容不由模型补造。PDF 定向恢复或后续解析修复属于单独实验，不改写这份冻结快照。</w:t>
+        <w:rPr>
+          <w:rFonts w:ascii="Microsoft YaHei" w:hAnsi="Microsoft YaHei" w:eastAsia="Microsoft YaHei" w:cs="Microsoft YaHei"/>
+          <w:b w:val="0"/>
+          <w:i w:val="0"/>
+          <w:color w:val="1A2230"/>
+          <w:sz w:val="21"/>
+        </w:rPr>
+        <w:t xml:space="preserve">WPS 进入旧 Word 转换路径；GBQ7 和 DWG 明确保留为不支持格式。无效响应、不可恢复源文件和不支持内容不由模型补造。PDF 定向恢复或后续解析修复属于单独实验，不改写这份冻结快照。</w:t>
       </w:r>
     </w:p>
     <w:p>
       <w:pPr>
-        <w:pStyle w:val="Heading1"/>
+        <w:keepNext/>
+        <w:spacing w:before="300" w:after="140" w:line="288" w:lineRule="auto"/>
+        <w:jc w:val="left"/>
       </w:pPr>
       <w:r>
-        <w:t>4 字段与关系质量</w:t>
-      </w:r>
-    </w:p>
-    <w:p>
-      <w:r>
-        <w:t>七字段保存源材料中可支持的信息。项目总金额、中标主体金额和单个标的总价分别建模；金额保留十进制精度和单位。当前查询只汇总已披露的标的总价，不通过数量和单价替代原文缺失值。采购人天服务、税金等因素可能造成标的合计与项目总额不一致，不能据此自动判错。</w:t>
-      </w:r>
-    </w:p>
-    <w:p>
-      <w:r>
-        <w:t>品牌与中标供应商分别处理，不以法律实体名称自动补品牌。参与主体保存 winner、nonwinner、unknown，结果未披露不等于未中标。名称型包号要求明确标签和值；缺可靠映射时使用 default，并提示包级统计可能合并。</w:t>
-      </w:r>
-    </w:p>
-    <w:p>
-      <w:r>
-        <w:br w:type="page"/>
+        <w:rPr>
+          <w:rFonts w:ascii="Microsoft YaHei" w:hAnsi="Microsoft YaHei" w:eastAsia="Microsoft YaHei" w:cs="Microsoft YaHei"/>
+          <w:b/>
+          <w:i w:val="0"/>
+          <w:color w:val="0E3F8C"/>
+          <w:sz w:val="27"/>
+        </w:rPr>
+        <w:t xml:space="preserve">4 字段与关系质量</w:t>
       </w:r>
     </w:p>
     <w:p>
       <w:pPr>
-        <w:pStyle w:val="Heading1"/>
+        <w:keepNext w:val="0"/>
+        <w:spacing w:before="0" w:after="140" w:line="360" w:lineRule="auto"/>
+        <w:jc w:val="both"/>
       </w:pPr>
       <w:r>
-        <w:t>5 来源证据与复核流程</w:t>
-      </w:r>
-    </w:p>
-    <w:p>
-      <w:r>
-        <w:t>新导入保存可获得的采购单位元数据证据、标的列级证据、明确未公示或空单元格状态以及输入 SHA-256。公告详情显示来源文件、定位、片段、警告和哈希。同名文件对应多个哈希时提示歧义，不把错误哈希当作证据。</w:t>
-      </w:r>
-    </w:p>
-    <w:p>
-      <w:r>
-        <w:t>历史数据中未保存的证据不能追溯生成：非空旧值显示待核验，旧空值保留未知状态。哈希只用于核对文件内容，不等于保存原件；应用不提供未保留原始字节的旧附件下载。</w:t>
-      </w:r>
-    </w:p>
-    <w:p>
-      <w:r>
-        <w:t>人工复核队列根据字段缺失、证据不足、OCR 或附件告警、default 包号和金额冲突排序。接受、修正和驳回记录操作者、时间、理由及前后值，候选代次防止重新导入后串接旧历史。复核覆盖与原机器候选分开保存，不自动回写 Gold 或改变统计结果。</w:t>
+        <w:rPr>
+          <w:rFonts w:ascii="Microsoft YaHei" w:hAnsi="Microsoft YaHei" w:eastAsia="Microsoft YaHei" w:cs="Microsoft YaHei"/>
+          <w:b w:val="0"/>
+          <w:i w:val="0"/>
+          <w:color w:val="1A2230"/>
+          <w:sz w:val="21"/>
+        </w:rPr>
+        <w:t xml:space="preserve">七字段保存源材料中可支持的信息。项目总金额、中标主体金额和单个标的总价分别建模；金额保留十进制精度和单位。当前查询只汇总已披露的标的总价，不通过数量和单价替代原文缺失值。采购人天服务、税金等因素可能造成标的合计与项目总额不一致，不能据此自动判错。</w:t>
       </w:r>
     </w:p>
     <w:p>
       <w:pPr>
-        <w:pStyle w:val="Heading1"/>
+        <w:keepNext w:val="0"/>
+        <w:spacing w:before="0" w:after="140" w:line="360" w:lineRule="auto"/>
+        <w:jc w:val="both"/>
       </w:pPr>
       <w:r>
-        <w:t>6 本地标注与质量复查</w:t>
-      </w:r>
-    </w:p>
-    <w:p>
-      <w:r>
-        <w:t>团队 reviewed 数据用于逐条对照原文和开发回归，预测不作为真值。当前 24 条样本已经参与过诊断，后续指标保持本地回归口径。来源修订生成 Gold v2 并保留旧版及修改台账；不覆盖历史预测和报告，不把两种 Gold 或两种 profile 的数字直接比较。</w:t>
-      </w:r>
-    </w:p>
-    <w:p>
-      <w:r>
-        <w:t>质量复查覆盖正文表格、附件表格、扫描件、旧式 Office、多包、多中标人、零候选及异常响应。复查项包括公告身份、包号、七字段、采购单位、参与角色、来源定位、哈希、告警和处理决定。独立保留异常记录，避免只抽查成功案例。</w:t>
+        <w:rPr>
+          <w:rFonts w:ascii="Microsoft YaHei" w:hAnsi="Microsoft YaHei" w:eastAsia="Microsoft YaHei" w:cs="Microsoft YaHei"/>
+          <w:b w:val="0"/>
+          <w:i w:val="0"/>
+          <w:color w:val="1A2230"/>
+          <w:sz w:val="21"/>
+        </w:rPr>
+        <w:t xml:space="preserve">品牌与中标供应商分别处理，不以法律实体名称自动补品牌。参与主体保存 winner、nonwinner、unknown，结果未披露不等于未中标。名称型包号要求明确标签和值；缺可靠映射时使用 default，并提示包级统计可能合并。</w:t>
       </w:r>
     </w:p>
     <w:p>
       <w:pPr>
-        <w:pStyle w:val="Heading1"/>
+        <w:keepNext/>
+        <w:spacing w:before="300" w:after="140" w:line="288" w:lineRule="auto"/>
+        <w:jc w:val="left"/>
       </w:pPr>
       <w:r>
-        <w:t>7 交付与数据管理</w:t>
+        <w:rPr>
+          <w:rFonts w:ascii="Microsoft YaHei" w:hAnsi="Microsoft YaHei" w:eastAsia="Microsoft YaHei" w:cs="Microsoft YaHei"/>
+          <w:b/>
+          <w:i w:val="0"/>
+          <w:color w:val="0E3F8C"/>
+          <w:sz w:val="27"/>
+        </w:rPr>
+        <w:t xml:space="preserve">5 官方结果补录与缺失分布</w:t>
       </w:r>
     </w:p>
     <w:p>
+      <w:pPr>
+        <w:keepNext w:val="0"/>
+        <w:spacing w:before="0" w:after="140" w:line="360" w:lineRule="auto"/>
+        <w:jc w:val="both"/>
+      </w:pPr>
       <w:r>
-        <w:t>公开仓库提供解析代码、测试、schema、虚构样例和聚合质量统计。任务一结果表、任务二关系模型和运行清单按比赛要求进入受控交付包；API Key、评审密码、原始模型响应和本机路径不随公开仓库发布。</w:t>
+        <w:rPr>
+          <w:rFonts w:ascii="Microsoft YaHei" w:hAnsi="Microsoft YaHei" w:eastAsia="Microsoft YaHei" w:cs="Microsoft YaHei"/>
+          <w:b w:val="0"/>
+          <w:i w:val="0"/>
+          <w:color w:val="1A2230"/>
+          <w:sz w:val="21"/>
+        </w:rPr>
+        <w:t xml:space="preserve">本轮使用保留的 1,038 份公告及压缩包，离线补录评审表、投标报价、得分和未中标原因等附表字段；不调用模型，也不覆盖原有任务一投影。补录扫描到 14,174 个来源成员，形成 6,477 条结构化观察；986 个成员按参考材料过滤，19 个成员单独记录为解析失败，311 个 PDF 因无可提取文字标记为需要人工查看，另有 262 个成员属于不支持格式或扫描待复核。该补录使用文本解析，未启用扫描件 OCR，因此这些记录不能宣称已完成字段抽取。</w:t>
+      </w:r>
+    </w:p>
+    <w:tbl>
+      <w:tblPr>
+        <w:tblW w:type="auto" w:w="0"/>
+        <w:jc w:val="center"/>
+        <w:tblLayout w:type="autofit"/>
+        <w:tblLook w:firstColumn="1" w:firstRow="1" w:lastColumn="0" w:lastRow="0" w:noHBand="0" w:noVBand="1" w:val="04A0"/>
+        <w:tblBorders>
+          <w:top w:val="single" w:sz="14" w:space="0" w:color="0E3F8C"/>
+          <w:bottom w:val="single" w:sz="14" w:space="0" w:color="0E3F8C"/>
+          <w:insideH w:val="single" w:sz="4" w:space="0" w:color="D6DCE5"/>
+          <w:left w:val="none" w:sz="0" w:space="0"/>
+          <w:right w:val="none" w:sz="0" w:space="0"/>
+          <w:insideV w:val="none" w:sz="0" w:space="0"/>
+        </w:tblBorders>
+        <w:tblCellMar>
+          <w:top w:w="60" w:type="dxa"/>
+          <w:left w:w="110" w:type="dxa"/>
+          <w:bottom w:w="60" w:type="dxa"/>
+          <w:right w:w="110" w:type="dxa"/>
+        </w:tblCellMar>
+      </w:tblPr>
+      <w:tblGrid>
+        <w:gridCol w:w="2211"/>
+        <w:gridCol w:w="907"/>
+        <w:gridCol w:w="907"/>
+        <w:gridCol w:w="4933"/>
+      </w:tblGrid>
+      <w:tr>
+        <w:trPr>
+          <w:cantSplit/>
+          <w:tblHeader/>
+        </w:trPr>
+        <w:tc>
+          <w:tcPr>
+            <w:tcW w:type="dxa" w:w="2211"/>
+            <w:shd w:val="clear" w:color="auto" w:fill="E8EFF8"/>
+            <w:tcBorders>
+              <w:bottom w:val="single" w:sz="10" w:color="0E3F8C"/>
+            </w:tcBorders>
+          </w:tcPr>
+          <w:p>
+            <w:pPr>
+              <w:keepNext w:val="0"/>
+              <w:spacing w:before="0" w:after="0" w:line="276" w:lineRule="auto"/>
+              <w:jc w:val="left"/>
+            </w:pPr>
+            <w:r>
+              <w:t xml:space="preserve">结果表抽取列</w:t>
+            </w:r>
+          </w:p>
+        </w:tc>
+        <w:tc>
+          <w:tcPr>
+            <w:tcW w:type="dxa" w:w="907"/>
+            <w:shd w:val="clear" w:color="auto" w:fill="E8EFF8"/>
+            <w:tcBorders>
+              <w:bottom w:val="single" w:sz="10" w:color="0E3F8C"/>
+            </w:tcBorders>
+          </w:tcPr>
+          <w:p>
+            <w:pPr>
+              <w:keepNext w:val="0"/>
+              <w:spacing w:before="0" w:after="0" w:line="276" w:lineRule="auto"/>
+              <w:jc w:val="left"/>
+            </w:pPr>
+            <w:r>
+              <w:t xml:space="preserve">非空行数</w:t>
+            </w:r>
+          </w:p>
+        </w:tc>
+        <w:tc>
+          <w:tcPr>
+            <w:tcW w:type="dxa" w:w="907"/>
+            <w:shd w:val="clear" w:color="auto" w:fill="E8EFF8"/>
+            <w:tcBorders>
+              <w:bottom w:val="single" w:sz="10" w:color="0E3F8C"/>
+            </w:tcBorders>
+          </w:tcPr>
+          <w:p>
+            <w:pPr>
+              <w:keepNext w:val="0"/>
+              <w:spacing w:before="0" w:after="0" w:line="276" w:lineRule="auto"/>
+              <w:jc w:val="left"/>
+            </w:pPr>
+            <w:r>
+              <w:t xml:space="preserve">空值行数</w:t>
+            </w:r>
+          </w:p>
+        </w:tc>
+        <w:tc>
+          <w:tcPr>
+            <w:tcW w:type="dxa" w:w="4933"/>
+            <w:shd w:val="clear" w:color="auto" w:fill="E8EFF8"/>
+            <w:tcBorders>
+              <w:bottom w:val="single" w:sz="10" w:color="0E3F8C"/>
+            </w:tcBorders>
+          </w:tcPr>
+          <w:p>
+            <w:pPr>
+              <w:keepNext w:val="0"/>
+              <w:spacing w:before="0" w:after="0" w:line="276" w:lineRule="auto"/>
+              <w:jc w:val="left"/>
+            </w:pPr>
+            <w:r>
+              <w:t xml:space="preserve">口径</w:t>
+            </w:r>
+          </w:p>
+        </w:tc>
+      </w:tr>
+      <w:tr>
+        <w:trPr>
+          <w:cantSplit/>
+        </w:trPr>
+        <w:tc>
+          <w:tcPr>
+            <w:tcW w:type="dxa" w:w="2211"/>
+          </w:tcPr>
+          <w:p>
+            <w:pPr>
+              <w:keepNext w:val="0"/>
+              <w:spacing w:before="0" w:after="0" w:line="276" w:lineRule="auto"/>
+              <w:jc w:val="left"/>
+            </w:pPr>
+            <w:r>
+              <w:t xml:space="preserve">总表·中标供应商</w:t>
+            </w:r>
+          </w:p>
+        </w:tc>
+        <w:tc>
+          <w:tcPr>
+            <w:tcW w:type="dxa" w:w="907"/>
+          </w:tcPr>
+          <w:p>
+            <w:pPr>
+              <w:keepNext w:val="0"/>
+              <w:spacing w:before="0" w:after="0" w:line="276" w:lineRule="auto"/>
+              <w:jc w:val="right"/>
+            </w:pPr>
+            <w:r>
+              <w:t xml:space="preserve">1,315</w:t>
+            </w:r>
+          </w:p>
+        </w:tc>
+        <w:tc>
+          <w:tcPr>
+            <w:tcW w:type="dxa" w:w="907"/>
+          </w:tcPr>
+          <w:p>
+            <w:pPr>
+              <w:keepNext w:val="0"/>
+              <w:spacing w:before="0" w:after="0" w:line="276" w:lineRule="auto"/>
+              <w:jc w:val="left"/>
+            </w:pPr>
+            <w:r>
+              <w:t xml:space="preserve">538</w:t>
+            </w:r>
+          </w:p>
+        </w:tc>
+        <w:tc>
+          <w:tcPr>
+            <w:tcW w:type="dxa" w:w="4933"/>
+          </w:tcPr>
+          <w:p>
+            <w:pPr>
+              <w:keepNext w:val="0"/>
+              <w:spacing w:before="0" w:after="0" w:line="276" w:lineRule="auto"/>
+              <w:jc w:val="left"/>
+            </w:pPr>
+            <w:r>
+              <w:t xml:space="preserve">1,853 行总表；只统计来源明确的中标记录</w:t>
+            </w:r>
+          </w:p>
+        </w:tc>
+      </w:tr>
+      <w:tr>
+        <w:trPr>
+          <w:cantSplit/>
+        </w:trPr>
+        <w:tc>
+          <w:tcPr>
+            <w:tcW w:type="dxa" w:w="2211"/>
+          </w:tcPr>
+          <w:p>
+            <w:pPr>
+              <w:keepNext w:val="0"/>
+              <w:spacing w:before="0" w:after="0" w:line="276" w:lineRule="auto"/>
+              <w:jc w:val="left"/>
+            </w:pPr>
+            <w:r>
+              <w:t xml:space="preserve">标的表·产品服务名称</w:t>
+            </w:r>
+          </w:p>
+        </w:tc>
+        <w:tc>
+          <w:tcPr>
+            <w:tcW w:type="dxa" w:w="907"/>
+          </w:tcPr>
+          <w:p>
+            <w:pPr>
+              <w:keepNext w:val="0"/>
+              <w:spacing w:before="0" w:after="0" w:line="276" w:lineRule="auto"/>
+              <w:jc w:val="right"/>
+            </w:pPr>
+            <w:r>
+              <w:t xml:space="preserve">6,459</w:t>
+            </w:r>
+          </w:p>
+        </w:tc>
+        <w:tc>
+          <w:tcPr>
+            <w:tcW w:type="dxa" w:w="907"/>
+          </w:tcPr>
+          <w:p>
+            <w:pPr>
+              <w:keepNext w:val="0"/>
+              <w:spacing w:before="0" w:after="0" w:line="276" w:lineRule="auto"/>
+              <w:jc w:val="left"/>
+            </w:pPr>
+            <w:r>
+              <w:t xml:space="preserve">13</w:t>
+            </w:r>
+          </w:p>
+        </w:tc>
+        <w:tc>
+          <w:tcPr>
+            <w:tcW w:type="dxa" w:w="4933"/>
+          </w:tcPr>
+          <w:p>
+            <w:pPr>
+              <w:keepNext w:val="0"/>
+              <w:spacing w:before="0" w:after="0" w:line="276" w:lineRule="auto"/>
+              <w:jc w:val="left"/>
+            </w:pPr>
+            <w:r>
+              <w:t xml:space="preserve">6,472 行标的表；照录来源名称</w:t>
+            </w:r>
+          </w:p>
+        </w:tc>
+      </w:tr>
+      <w:tr>
+        <w:trPr>
+          <w:cantSplit/>
+        </w:trPr>
+        <w:tc>
+          <w:tcPr>
+            <w:tcW w:type="dxa" w:w="2211"/>
+          </w:tcPr>
+          <w:p>
+            <w:pPr>
+              <w:keepNext w:val="0"/>
+              <w:spacing w:before="0" w:after="0" w:line="276" w:lineRule="auto"/>
+              <w:jc w:val="left"/>
+            </w:pPr>
+            <w:r>
+              <w:t xml:space="preserve">标的表·品目</w:t>
+            </w:r>
+          </w:p>
+        </w:tc>
+        <w:tc>
+          <w:tcPr>
+            <w:tcW w:type="dxa" w:w="907"/>
+          </w:tcPr>
+          <w:p>
+            <w:pPr>
+              <w:keepNext w:val="0"/>
+              <w:spacing w:before="0" w:after="0" w:line="276" w:lineRule="auto"/>
+              <w:jc w:val="right"/>
+            </w:pPr>
+            <w:r>
+              <w:t xml:space="preserve">3,095</w:t>
+            </w:r>
+          </w:p>
+        </w:tc>
+        <w:tc>
+          <w:tcPr>
+            <w:tcW w:type="dxa" w:w="907"/>
+          </w:tcPr>
+          <w:p>
+            <w:pPr>
+              <w:keepNext w:val="0"/>
+              <w:spacing w:before="0" w:after="0" w:line="276" w:lineRule="auto"/>
+              <w:jc w:val="left"/>
+            </w:pPr>
+            <w:r>
+              <w:t xml:space="preserve">3,377</w:t>
+            </w:r>
+          </w:p>
+        </w:tc>
+        <w:tc>
+          <w:tcPr>
+            <w:tcW w:type="dxa" w:w="4933"/>
+          </w:tcPr>
+          <w:p>
+            <w:pPr>
+              <w:keepNext w:val="0"/>
+              <w:spacing w:before="0" w:after="0" w:line="276" w:lineRule="auto"/>
+              <w:jc w:val="left"/>
+            </w:pPr>
+            <w:r>
+              <w:t xml:space="preserve">不凭产品名称补造品目</w:t>
+            </w:r>
+          </w:p>
+        </w:tc>
+      </w:tr>
+      <w:tr>
+        <w:trPr>
+          <w:cantSplit/>
+        </w:trPr>
+        <w:tc>
+          <w:tcPr>
+            <w:tcW w:type="dxa" w:w="2211"/>
+          </w:tcPr>
+          <w:p>
+            <w:pPr>
+              <w:keepNext w:val="0"/>
+              <w:spacing w:before="0" w:after="0" w:line="276" w:lineRule="auto"/>
+              <w:jc w:val="left"/>
+            </w:pPr>
+            <w:r>
+              <w:t xml:space="preserve">标的表·品牌</w:t>
+            </w:r>
+          </w:p>
+        </w:tc>
+        <w:tc>
+          <w:tcPr>
+            <w:tcW w:type="dxa" w:w="907"/>
+          </w:tcPr>
+          <w:p>
+            <w:pPr>
+              <w:keepNext w:val="0"/>
+              <w:spacing w:before="0" w:after="0" w:line="276" w:lineRule="auto"/>
+              <w:jc w:val="right"/>
+            </w:pPr>
+            <w:r>
+              <w:t xml:space="preserve">4,992</w:t>
+            </w:r>
+          </w:p>
+        </w:tc>
+        <w:tc>
+          <w:tcPr>
+            <w:tcW w:type="dxa" w:w="907"/>
+          </w:tcPr>
+          <w:p>
+            <w:pPr>
+              <w:keepNext w:val="0"/>
+              <w:spacing w:before="0" w:after="0" w:line="276" w:lineRule="auto"/>
+              <w:jc w:val="left"/>
+            </w:pPr>
+            <w:r>
+              <w:t xml:space="preserve">1,480</w:t>
+            </w:r>
+          </w:p>
+        </w:tc>
+        <w:tc>
+          <w:tcPr>
+            <w:tcW w:type="dxa" w:w="4933"/>
+          </w:tcPr>
+          <w:p>
+            <w:pPr>
+              <w:keepNext w:val="0"/>
+              <w:spacing w:before="0" w:after="0" w:line="276" w:lineRule="auto"/>
+              <w:jc w:val="left"/>
+            </w:pPr>
+            <w:r>
+              <w:t xml:space="preserve">不用供应商名称代替品牌</w:t>
+            </w:r>
+          </w:p>
+        </w:tc>
+      </w:tr>
+      <w:tr>
+        <w:trPr>
+          <w:cantSplit/>
+        </w:trPr>
+        <w:tc>
+          <w:tcPr>
+            <w:tcW w:type="dxa" w:w="2211"/>
+          </w:tcPr>
+          <w:p>
+            <w:pPr>
+              <w:keepNext w:val="0"/>
+              <w:spacing w:before="0" w:after="0" w:line="276" w:lineRule="auto"/>
+              <w:jc w:val="left"/>
+            </w:pPr>
+            <w:r>
+              <w:t xml:space="preserve">标的表·规格型号</w:t>
+            </w:r>
+          </w:p>
+        </w:tc>
+        <w:tc>
+          <w:tcPr>
+            <w:tcW w:type="dxa" w:w="907"/>
+          </w:tcPr>
+          <w:p>
+            <w:pPr>
+              <w:keepNext w:val="0"/>
+              <w:spacing w:before="0" w:after="0" w:line="276" w:lineRule="auto"/>
+              <w:jc w:val="right"/>
+            </w:pPr>
+            <w:r>
+              <w:t xml:space="preserve">4,950</w:t>
+            </w:r>
+          </w:p>
+        </w:tc>
+        <w:tc>
+          <w:tcPr>
+            <w:tcW w:type="dxa" w:w="907"/>
+          </w:tcPr>
+          <w:p>
+            <w:pPr>
+              <w:keepNext w:val="0"/>
+              <w:spacing w:before="0" w:after="0" w:line="276" w:lineRule="auto"/>
+              <w:jc w:val="left"/>
+            </w:pPr>
+            <w:r>
+              <w:t xml:space="preserve">1,522</w:t>
+            </w:r>
+          </w:p>
+        </w:tc>
+        <w:tc>
+          <w:tcPr>
+            <w:tcW w:type="dxa" w:w="4933"/>
+          </w:tcPr>
+          <w:p>
+            <w:pPr>
+              <w:keepNext w:val="0"/>
+              <w:spacing w:before="0" w:after="0" w:line="276" w:lineRule="auto"/>
+              <w:jc w:val="left"/>
+            </w:pPr>
+            <w:r>
+              <w:t xml:space="preserve">原文未可靠提取时留空</w:t>
+            </w:r>
+          </w:p>
+        </w:tc>
+      </w:tr>
+      <w:tr>
+        <w:trPr>
+          <w:cantSplit/>
+        </w:trPr>
+        <w:tc>
+          <w:tcPr>
+            <w:tcW w:type="dxa" w:w="2211"/>
+          </w:tcPr>
+          <w:p>
+            <w:pPr>
+              <w:keepNext w:val="0"/>
+              <w:spacing w:before="0" w:after="0" w:line="276" w:lineRule="auto"/>
+              <w:jc w:val="left"/>
+            </w:pPr>
+            <w:r>
+              <w:t xml:space="preserve">标的表·数量</w:t>
+            </w:r>
+          </w:p>
+        </w:tc>
+        <w:tc>
+          <w:tcPr>
+            <w:tcW w:type="dxa" w:w="907"/>
+          </w:tcPr>
+          <w:p>
+            <w:pPr>
+              <w:keepNext w:val="0"/>
+              <w:spacing w:before="0" w:after="0" w:line="276" w:lineRule="auto"/>
+              <w:jc w:val="right"/>
+            </w:pPr>
+            <w:r>
+              <w:t xml:space="preserve">5,911</w:t>
+            </w:r>
+          </w:p>
+        </w:tc>
+        <w:tc>
+          <w:tcPr>
+            <w:tcW w:type="dxa" w:w="907"/>
+          </w:tcPr>
+          <w:p>
+            <w:pPr>
+              <w:keepNext w:val="0"/>
+              <w:spacing w:before="0" w:after="0" w:line="276" w:lineRule="auto"/>
+              <w:jc w:val="left"/>
+            </w:pPr>
+            <w:r>
+              <w:t xml:space="preserve">561</w:t>
+            </w:r>
+          </w:p>
+        </w:tc>
+        <w:tc>
+          <w:tcPr>
+            <w:tcW w:type="dxa" w:w="4933"/>
+          </w:tcPr>
+          <w:p>
+            <w:pPr>
+              <w:keepNext w:val="0"/>
+              <w:spacing w:before="0" w:after="0" w:line="276" w:lineRule="auto"/>
+              <w:jc w:val="left"/>
+            </w:pPr>
+            <w:r>
+              <w:t xml:space="preserve">保留可确认的数量</w:t>
+            </w:r>
+          </w:p>
+        </w:tc>
+      </w:tr>
+      <w:tr>
+        <w:trPr>
+          <w:cantSplit/>
+        </w:trPr>
+        <w:tc>
+          <w:tcPr>
+            <w:tcW w:type="dxa" w:w="2211"/>
+          </w:tcPr>
+          <w:p>
+            <w:pPr>
+              <w:keepNext w:val="0"/>
+              <w:spacing w:before="0" w:after="0" w:line="276" w:lineRule="auto"/>
+              <w:jc w:val="left"/>
+            </w:pPr>
+            <w:r>
+              <w:t xml:space="preserve">标的表·单价</w:t>
+            </w:r>
+          </w:p>
+        </w:tc>
+        <w:tc>
+          <w:tcPr>
+            <w:tcW w:type="dxa" w:w="907"/>
+          </w:tcPr>
+          <w:p>
+            <w:pPr>
+              <w:keepNext w:val="0"/>
+              <w:spacing w:before="0" w:after="0" w:line="276" w:lineRule="auto"/>
+              <w:jc w:val="right"/>
+            </w:pPr>
+            <w:r>
+              <w:t xml:space="preserve">4,193</w:t>
+            </w:r>
+          </w:p>
+        </w:tc>
+        <w:tc>
+          <w:tcPr>
+            <w:tcW w:type="dxa" w:w="907"/>
+          </w:tcPr>
+          <w:p>
+            <w:pPr>
+              <w:keepNext w:val="0"/>
+              <w:spacing w:before="0" w:after="0" w:line="276" w:lineRule="auto"/>
+              <w:jc w:val="left"/>
+            </w:pPr>
+            <w:r>
+              <w:t xml:space="preserve">2,279</w:t>
+            </w:r>
+          </w:p>
+        </w:tc>
+        <w:tc>
+          <w:tcPr>
+            <w:tcW w:type="dxa" w:w="4933"/>
+          </w:tcPr>
+          <w:p>
+            <w:pPr>
+              <w:keepNext w:val="0"/>
+              <w:spacing w:before="0" w:after="0" w:line="276" w:lineRule="auto"/>
+              <w:jc w:val="left"/>
+            </w:pPr>
+            <w:r>
+              <w:t xml:space="preserve">6,472 行标的表；保留万元换算后的全部有效小数</w:t>
+            </w:r>
+          </w:p>
+        </w:tc>
+      </w:tr>
+      <w:tr>
+        <w:trPr>
+          <w:cantSplit/>
+        </w:trPr>
+        <w:tc>
+          <w:tcPr>
+            <w:tcW w:type="dxa" w:w="2211"/>
+          </w:tcPr>
+          <w:p>
+            <w:pPr>
+              <w:keepNext w:val="0"/>
+              <w:spacing w:before="0" w:after="0" w:line="276" w:lineRule="auto"/>
+              <w:jc w:val="left"/>
+            </w:pPr>
+            <w:r>
+              <w:t xml:space="preserve">标的表·总价</w:t>
+            </w:r>
+          </w:p>
+        </w:tc>
+        <w:tc>
+          <w:tcPr>
+            <w:tcW w:type="dxa" w:w="907"/>
+          </w:tcPr>
+          <w:p>
+            <w:pPr>
+              <w:keepNext w:val="0"/>
+              <w:spacing w:before="0" w:after="0" w:line="276" w:lineRule="auto"/>
+              <w:jc w:val="right"/>
+            </w:pPr>
+            <w:r>
+              <w:t xml:space="preserve">3,630</w:t>
+            </w:r>
+          </w:p>
+        </w:tc>
+        <w:tc>
+          <w:tcPr>
+            <w:tcW w:type="dxa" w:w="907"/>
+          </w:tcPr>
+          <w:p>
+            <w:pPr>
+              <w:keepNext w:val="0"/>
+              <w:spacing w:before="0" w:after="0" w:line="276" w:lineRule="auto"/>
+              <w:jc w:val="left"/>
+            </w:pPr>
+            <w:r>
+              <w:t xml:space="preserve">2,842</w:t>
+            </w:r>
+          </w:p>
+        </w:tc>
+        <w:tc>
+          <w:tcPr>
+            <w:tcW w:type="dxa" w:w="4933"/>
+          </w:tcPr>
+          <w:p>
+            <w:pPr>
+              <w:keepNext w:val="0"/>
+              <w:spacing w:before="0" w:after="0" w:line="276" w:lineRule="auto"/>
+              <w:jc w:val="left"/>
+            </w:pPr>
+            <w:r>
+              <w:t xml:space="preserve">不以单价×数量覆盖缺失或冲突原值</w:t>
+            </w:r>
+          </w:p>
+        </w:tc>
+      </w:tr>
+      <w:tr>
+        <w:trPr>
+          <w:cantSplit/>
+        </w:trPr>
+        <w:tc>
+          <w:tcPr>
+            <w:tcW w:type="dxa" w:w="2211"/>
+          </w:tcPr>
+          <w:p>
+            <w:pPr>
+              <w:keepNext w:val="0"/>
+              <w:spacing w:before="0" w:after="0" w:line="276" w:lineRule="auto"/>
+              <w:jc w:val="left"/>
+            </w:pPr>
+            <w:r>
+              <w:t xml:space="preserve">投标人表·通过审查</w:t>
+            </w:r>
+          </w:p>
+        </w:tc>
+        <w:tc>
+          <w:tcPr>
+            <w:tcW w:type="dxa" w:w="907"/>
+          </w:tcPr>
+          <w:p>
+            <w:pPr>
+              <w:keepNext w:val="0"/>
+              <w:spacing w:before="0" w:after="0" w:line="276" w:lineRule="auto"/>
+              <w:jc w:val="right"/>
+            </w:pPr>
+            <w:r>
+              <w:t xml:space="preserve">4,030</w:t>
+            </w:r>
+          </w:p>
+        </w:tc>
+        <w:tc>
+          <w:tcPr>
+            <w:tcW w:type="dxa" w:w="907"/>
+          </w:tcPr>
+          <w:p>
+            <w:pPr>
+              <w:keepNext w:val="0"/>
+              <w:spacing w:before="0" w:after="0" w:line="276" w:lineRule="auto"/>
+              <w:jc w:val="left"/>
+            </w:pPr>
+            <w:r>
+              <w:t xml:space="preserve">1,376</w:t>
+            </w:r>
+          </w:p>
+        </w:tc>
+        <w:tc>
+          <w:tcPr>
+            <w:tcW w:type="dxa" w:w="4933"/>
+          </w:tcPr>
+          <w:p>
+            <w:pPr>
+              <w:keepNext w:val="0"/>
+              <w:spacing w:before="0" w:after="0" w:line="276" w:lineRule="auto"/>
+              <w:jc w:val="left"/>
+            </w:pPr>
+            <w:r>
+              <w:t xml:space="preserve">5,406 行投标人表；仅有明确审查结论才填写</w:t>
+            </w:r>
+          </w:p>
+        </w:tc>
+      </w:tr>
+      <w:tr>
+        <w:trPr>
+          <w:cantSplit/>
+        </w:trPr>
+        <w:tc>
+          <w:tcPr>
+            <w:tcW w:type="dxa" w:w="2211"/>
+          </w:tcPr>
+          <w:p>
+            <w:pPr>
+              <w:keepNext w:val="0"/>
+              <w:spacing w:before="0" w:after="0" w:line="276" w:lineRule="auto"/>
+              <w:jc w:val="left"/>
+            </w:pPr>
+            <w:r>
+              <w:t xml:space="preserve">投标人表·报价</w:t>
+            </w:r>
+          </w:p>
+        </w:tc>
+        <w:tc>
+          <w:tcPr>
+            <w:tcW w:type="dxa" w:w="907"/>
+          </w:tcPr>
+          <w:p>
+            <w:pPr>
+              <w:keepNext w:val="0"/>
+              <w:spacing w:before="0" w:after="0" w:line="276" w:lineRule="auto"/>
+              <w:jc w:val="right"/>
+            </w:pPr>
+            <w:r>
+              <w:t xml:space="preserve">300</w:t>
+            </w:r>
+          </w:p>
+        </w:tc>
+        <w:tc>
+          <w:tcPr>
+            <w:tcW w:type="dxa" w:w="907"/>
+          </w:tcPr>
+          <w:p>
+            <w:pPr>
+              <w:keepNext w:val="0"/>
+              <w:spacing w:before="0" w:after="0" w:line="276" w:lineRule="auto"/>
+              <w:jc w:val="left"/>
+            </w:pPr>
+            <w:r>
+              <w:t xml:space="preserve">5,106</w:t>
+            </w:r>
+          </w:p>
+        </w:tc>
+        <w:tc>
+          <w:tcPr>
+            <w:tcW w:type="dxa" w:w="4933"/>
+          </w:tcPr>
+          <w:p>
+            <w:pPr>
+              <w:keepNext w:val="0"/>
+              <w:spacing w:before="0" w:after="0" w:line="276" w:lineRule="auto"/>
+              <w:jc w:val="left"/>
+            </w:pPr>
+            <w:r>
+              <w:t xml:space="preserve">没有可靠货币单位时留空</w:t>
+            </w:r>
+          </w:p>
+        </w:tc>
+      </w:tr>
+      <w:tr>
+        <w:trPr>
+          <w:cantSplit/>
+        </w:trPr>
+        <w:tc>
+          <w:tcPr>
+            <w:tcW w:type="dxa" w:w="2211"/>
+          </w:tcPr>
+          <w:p>
+            <w:pPr>
+              <w:keepNext w:val="0"/>
+              <w:spacing w:before="0" w:after="0" w:line="276" w:lineRule="auto"/>
+              <w:jc w:val="left"/>
+            </w:pPr>
+            <w:r>
+              <w:t xml:space="preserve">投标人表·得分</w:t>
+            </w:r>
+          </w:p>
+        </w:tc>
+        <w:tc>
+          <w:tcPr>
+            <w:tcW w:type="dxa" w:w="907"/>
+          </w:tcPr>
+          <w:p>
+            <w:pPr>
+              <w:keepNext w:val="0"/>
+              <w:spacing w:before="0" w:after="0" w:line="276" w:lineRule="auto"/>
+              <w:jc w:val="right"/>
+            </w:pPr>
+            <w:r>
+              <w:t xml:space="preserve">4,358</w:t>
+            </w:r>
+          </w:p>
+        </w:tc>
+        <w:tc>
+          <w:tcPr>
+            <w:tcW w:type="dxa" w:w="907"/>
+          </w:tcPr>
+          <w:p>
+            <w:pPr>
+              <w:keepNext w:val="0"/>
+              <w:spacing w:before="0" w:after="0" w:line="276" w:lineRule="auto"/>
+              <w:jc w:val="left"/>
+            </w:pPr>
+            <w:r>
+              <w:t xml:space="preserve">1,048</w:t>
+            </w:r>
+          </w:p>
+        </w:tc>
+        <w:tc>
+          <w:tcPr>
+            <w:tcW w:type="dxa" w:w="4933"/>
+          </w:tcPr>
+          <w:p>
+            <w:pPr>
+              <w:keepNext w:val="0"/>
+              <w:spacing w:before="0" w:after="0" w:line="276" w:lineRule="auto"/>
+              <w:jc w:val="left"/>
+            </w:pPr>
+            <w:r>
+              <w:t xml:space="preserve">不把排名当得分</w:t>
+            </w:r>
+          </w:p>
+        </w:tc>
+      </w:tr>
+      <w:tr>
+        <w:trPr>
+          <w:cantSplit/>
+        </w:trPr>
+        <w:tc>
+          <w:tcPr>
+            <w:tcW w:type="dxa" w:w="2211"/>
+          </w:tcPr>
+          <w:p>
+            <w:pPr>
+              <w:keepNext w:val="0"/>
+              <w:spacing w:before="0" w:after="0" w:line="276" w:lineRule="auto"/>
+              <w:jc w:val="left"/>
+            </w:pPr>
+            <w:r>
+              <w:t xml:space="preserve">投标人表·未中标原因</w:t>
+            </w:r>
+          </w:p>
+        </w:tc>
+        <w:tc>
+          <w:tcPr>
+            <w:tcW w:type="dxa" w:w="907"/>
+          </w:tcPr>
+          <w:p>
+            <w:pPr>
+              <w:keepNext w:val="0"/>
+              <w:spacing w:before="0" w:after="0" w:line="276" w:lineRule="auto"/>
+              <w:jc w:val="right"/>
+            </w:pPr>
+            <w:r>
+              <w:t xml:space="preserve">1,047</w:t>
+            </w:r>
+          </w:p>
+        </w:tc>
+        <w:tc>
+          <w:tcPr>
+            <w:tcW w:type="dxa" w:w="907"/>
+          </w:tcPr>
+          <w:p>
+            <w:pPr>
+              <w:keepNext w:val="0"/>
+              <w:spacing w:before="0" w:after="0" w:line="276" w:lineRule="auto"/>
+              <w:jc w:val="left"/>
+            </w:pPr>
+            <w:r>
+              <w:t xml:space="preserve">4,359</w:t>
+            </w:r>
+          </w:p>
+        </w:tc>
+        <w:tc>
+          <w:tcPr>
+            <w:tcW w:type="dxa" w:w="4933"/>
+          </w:tcPr>
+          <w:p>
+            <w:pPr>
+              <w:keepNext w:val="0"/>
+              <w:spacing w:before="0" w:after="0" w:line="276" w:lineRule="auto"/>
+              <w:jc w:val="left"/>
+            </w:pPr>
+            <w:r>
+              <w:t xml:space="preserve">原文未披露时留空</w:t>
+            </w:r>
+          </w:p>
+        </w:tc>
+      </w:tr>
+    </w:tbl>
+    <w:p>
+      <w:pPr>
+        <w:keepNext w:val="0"/>
+        <w:spacing w:before="0" w:after="0" w:line="240" w:lineRule="auto"/>
+        <w:jc w:val="both"/>
+      </w:pPr>
+    </w:p>
+    <w:p>
+      <w:pPr>
+        <w:keepNext w:val="0"/>
+        <w:spacing w:before="0" w:after="140" w:line="360" w:lineRule="auto"/>
+        <w:jc w:val="both"/>
+      </w:pPr>
+      <w:r>
+        <w:rPr>
+          <w:rFonts w:ascii="Microsoft YaHei" w:hAnsi="Microsoft YaHei" w:eastAsia="Microsoft YaHei" w:cs="Microsoft YaHei"/>
+          <w:b w:val="0"/>
+          <w:i w:val="0"/>
+          <w:color w:val="1A2230"/>
+          <w:sz w:val="21"/>
+        </w:rPr>
+        <w:t xml:space="preserve">表中“空值”表示当前抽取没有足够证据，不等于原文未披露。来源处理计数来自补录回执，非空与空值计数直接扫描最终工作簿生成；两者分别描述处理过程和最终导出结果。</w:t>
       </w:r>
     </w:p>
     <w:p>
+      <w:pPr>
+        <w:keepNext w:val="0"/>
+        <w:spacing w:before="0" w:after="140" w:line="360" w:lineRule="auto"/>
+        <w:jc w:val="both"/>
+      </w:pPr>
       <w:r>
-        <w:t>统计的日期、输入范围和失败分类均可回溯至快照。1,038 条处理完成说明管线具备实际材料处理能力；字段准确性以明确 Gold、指标 profile 和匹配边界下的本地结果表述。该区分使评委可以分别核查系统能力、数据质量和算法效果。</w:t>
+        <w:rPr>
+          <w:rFonts w:ascii="Microsoft YaHei" w:hAnsi="Microsoft YaHei" w:eastAsia="Microsoft YaHei" w:cs="Microsoft YaHei"/>
+          <w:b w:val="0"/>
+          <w:i w:val="0"/>
+          <w:color w:val="1A2230"/>
+          <w:sz w:val="21"/>
+        </w:rPr>
+        <w:t xml:space="preserve">全量 HTML 公告的源包号与数据库包记录复核结果为 1,038/1,038 公告缺失 0、包号不一致 0；该覆盖不包含无法从 HTML 直接判断的附件内部包号。标的单价×数量与已披露总价的精确比较发现 11 条差异，均保留原文总价并在结果表“备注”列标记，未自动改写。</w:t>
+      </w:r>
+    </w:p>
+    <w:p>
+      <w:pPr>
+        <w:keepNext/>
+        <w:spacing w:before="300" w:after="140" w:line="288" w:lineRule="auto"/>
+        <w:jc w:val="left"/>
+      </w:pPr>
+      <w:r>
+        <w:rPr>
+          <w:rFonts w:ascii="Microsoft YaHei" w:hAnsi="Microsoft YaHei" w:eastAsia="Microsoft YaHei" w:cs="Microsoft YaHei"/>
+          <w:b/>
+          <w:i w:val="0"/>
+          <w:color w:val="0E3F8C"/>
+          <w:sz w:val="27"/>
+        </w:rPr>
+        <w:t xml:space="preserve">6 来源证据与复核流程</w:t>
+      </w:r>
+    </w:p>
+    <w:p>
+      <w:pPr>
+        <w:keepNext w:val="0"/>
+        <w:spacing w:before="0" w:after="140" w:line="360" w:lineRule="auto"/>
+        <w:jc w:val="both"/>
+      </w:pPr>
+      <w:r>
+        <w:rPr>
+          <w:rFonts w:ascii="Microsoft YaHei" w:hAnsi="Microsoft YaHei" w:eastAsia="Microsoft YaHei" w:cs="Microsoft YaHei"/>
+          <w:b w:val="0"/>
+          <w:i w:val="0"/>
+          <w:color w:val="1A2230"/>
+          <w:sz w:val="21"/>
+        </w:rPr>
+        <w:t xml:space="preserve">新导入保存可获得的采购单位元数据证据、标的列级证据、明确未公示或空单元格状态以及输入 SHA-256。公告详情显示来源文件、定位、片段、警告和哈希。同名文件对应多个哈希时提示歧义，不把错误哈希当作证据。</w:t>
+      </w:r>
+    </w:p>
+    <w:p>
+      <w:pPr>
+        <w:keepNext w:val="0"/>
+        <w:spacing w:before="0" w:after="140" w:line="360" w:lineRule="auto"/>
+        <w:jc w:val="both"/>
+      </w:pPr>
+      <w:r>
+        <w:rPr>
+          <w:rFonts w:ascii="Microsoft YaHei" w:hAnsi="Microsoft YaHei" w:eastAsia="Microsoft YaHei" w:cs="Microsoft YaHei"/>
+          <w:b w:val="0"/>
+          <w:i w:val="0"/>
+          <w:color w:val="1A2230"/>
+          <w:sz w:val="21"/>
+        </w:rPr>
+        <w:t xml:space="preserve">历史数据中未保存的证据不能追溯生成：非空旧值显示待核验，旧空值保留未知状态。哈希只用于核对文件内容，不等于保存原件；应用不提供未保留原始字节的旧附件下载。</w:t>
+      </w:r>
+    </w:p>
+    <w:p>
+      <w:pPr>
+        <w:keepNext w:val="0"/>
+        <w:spacing w:before="0" w:after="140" w:line="360" w:lineRule="auto"/>
+        <w:jc w:val="both"/>
+      </w:pPr>
+      <w:r>
+        <w:rPr>
+          <w:rFonts w:ascii="Microsoft YaHei" w:hAnsi="Microsoft YaHei" w:eastAsia="Microsoft YaHei" w:cs="Microsoft YaHei"/>
+          <w:b w:val="0"/>
+          <w:i w:val="0"/>
+          <w:color w:val="1A2230"/>
+          <w:sz w:val="21"/>
+        </w:rPr>
+        <w:t xml:space="preserve">人工复核队列根据字段缺失、证据不足、OCR 或附件告警、default 包号和金额冲突排序。接受、修正和驳回记录操作者、时间、理由及前后值，候选代次防止重新导入后串接旧历史。复核覆盖与原机器候选分开保存，不自动回写 Gold 或改变统计结果。</w:t>
+      </w:r>
+    </w:p>
+    <w:p>
+      <w:pPr>
+        <w:keepNext/>
+        <w:spacing w:before="300" w:after="140" w:line="288" w:lineRule="auto"/>
+        <w:jc w:val="left"/>
+      </w:pPr>
+      <w:r>
+        <w:rPr>
+          <w:rFonts w:ascii="Microsoft YaHei" w:hAnsi="Microsoft YaHei" w:eastAsia="Microsoft YaHei" w:cs="Microsoft YaHei"/>
+          <w:b/>
+          <w:i w:val="0"/>
+          <w:color w:val="0E3F8C"/>
+          <w:sz w:val="27"/>
+        </w:rPr>
+        <w:t xml:space="preserve">7 本地标注与质量复查</w:t>
+      </w:r>
+    </w:p>
+    <w:p>
+      <w:pPr>
+        <w:keepNext w:val="0"/>
+        <w:spacing w:before="0" w:after="140" w:line="360" w:lineRule="auto"/>
+        <w:jc w:val="both"/>
+      </w:pPr>
+      <w:r>
+        <w:rPr>
+          <w:rFonts w:ascii="Microsoft YaHei" w:hAnsi="Microsoft YaHei" w:eastAsia="Microsoft YaHei" w:cs="Microsoft YaHei"/>
+          <w:b w:val="0"/>
+          <w:i w:val="0"/>
+          <w:color w:val="1A2230"/>
+          <w:sz w:val="21"/>
+        </w:rPr>
+        <w:t xml:space="preserve">团队 reviewed 数据用于逐条对照原文和开发回归，预测不作为真值。当前 24 条样本已经参与过诊断，后续指标保持本地回归口径。来源修订生成 Gold v2 并保留旧版及修改台账；不覆盖历史预测和报告，不把两种 Gold 或两种 profile 的数字直接比较。</w:t>
+      </w:r>
+    </w:p>
+    <w:p>
+      <w:pPr>
+        <w:keepNext w:val="0"/>
+        <w:spacing w:before="0" w:after="140" w:line="360" w:lineRule="auto"/>
+        <w:jc w:val="both"/>
+      </w:pPr>
+      <w:r>
+        <w:rPr>
+          <w:rFonts w:ascii="Microsoft YaHei" w:hAnsi="Microsoft YaHei" w:eastAsia="Microsoft YaHei" w:cs="Microsoft YaHei"/>
+          <w:b w:val="0"/>
+          <w:i w:val="0"/>
+          <w:color w:val="1A2230"/>
+          <w:sz w:val="21"/>
+        </w:rPr>
+        <w:t xml:space="preserve">真实开发迭代证据来自 2026-10-09 固定的 24 条 reviewed 回归集：同口径的历史附件用途候选由 5、9 条降为 0，PDF 历史候选由 9 条降为 0；跨文件候选融合由 332 条降为 309 条且包数保持 59；cache-only 回放中 hybrid 153→146、model 149→139，10 条缺少 parse cache 被隔离，新模型请求为 0。这些数字是固定输入上的诊断对比，不是 1,038 条官方准确率，也不与本轮补录观察数相加。</w:t>
+      </w:r>
+    </w:p>
+    <w:p>
+      <w:pPr>
+        <w:keepNext w:val="0"/>
+        <w:spacing w:before="0" w:after="140" w:line="360" w:lineRule="auto"/>
+        <w:jc w:val="both"/>
+      </w:pPr>
+      <w:r>
+        <w:rPr>
+          <w:rFonts w:ascii="Microsoft YaHei" w:hAnsi="Microsoft YaHei" w:eastAsia="Microsoft YaHei" w:cs="Microsoft YaHei"/>
+          <w:b w:val="0"/>
+          <w:i w:val="0"/>
+          <w:color w:val="1A2230"/>
+          <w:sz w:val="21"/>
+        </w:rPr>
+        <w:t xml:space="preserve">质量复查覆盖正文表格、附件表格、扫描件、旧式 Office、多包、多中标人、零候选及异常响应。复查项包括公告身份、包号、七字段、采购单位、参与角色、来源定位、哈希、告警和处理决定。独立保留异常记录，避免只抽查成功案例。</w:t>
+      </w:r>
+    </w:p>
+    <w:p>
+      <w:pPr>
+        <w:keepNext/>
+        <w:spacing w:before="300" w:after="140" w:line="288" w:lineRule="auto"/>
+        <w:jc w:val="left"/>
+      </w:pPr>
+      <w:r>
+        <w:rPr>
+          <w:rFonts w:ascii="Microsoft YaHei" w:hAnsi="Microsoft YaHei" w:eastAsia="Microsoft YaHei" w:cs="Microsoft YaHei"/>
+          <w:b/>
+          <w:i w:val="0"/>
+          <w:color w:val="0E3F8C"/>
+          <w:sz w:val="27"/>
+        </w:rPr>
+        <w:t xml:space="preserve">8 交付与数据管理</w:t>
+      </w:r>
+    </w:p>
+    <w:p>
+      <w:pPr>
+        <w:keepNext w:val="0"/>
+        <w:spacing w:before="0" w:after="140" w:line="360" w:lineRule="auto"/>
+        <w:jc w:val="both"/>
+      </w:pPr>
+      <w:r>
+        <w:rPr>
+          <w:rFonts w:ascii="Microsoft YaHei" w:hAnsi="Microsoft YaHei" w:eastAsia="Microsoft YaHei" w:cs="Microsoft YaHei"/>
+          <w:b w:val="0"/>
+          <w:i w:val="0"/>
+          <w:color w:val="1A2230"/>
+          <w:sz w:val="21"/>
+        </w:rPr>
+        <w:t xml:space="preserve">公开仓库提供解析代码、测试、schema、虚构样例和聚合质量统计。任务一结果表、任务二关系模型和运行清单按比赛要求进入受控交付包；API Key、评审密码、原始模型响应和本机路径不随公开仓库发布。</w:t>
+      </w:r>
+    </w:p>
+    <w:p>
+      <w:pPr>
+        <w:keepNext w:val="0"/>
+        <w:spacing w:before="0" w:after="140" w:line="360" w:lineRule="auto"/>
+        <w:jc w:val="both"/>
+      </w:pPr>
+      <w:r>
+        <w:rPr>
+          <w:rFonts w:ascii="Microsoft YaHei" w:hAnsi="Microsoft YaHei" w:eastAsia="Microsoft YaHei" w:cs="Microsoft YaHei"/>
+          <w:b w:val="0"/>
+          <w:i w:val="0"/>
+          <w:color w:val="1A2230"/>
+          <w:sz w:val="21"/>
+        </w:rPr>
+        <w:t xml:space="preserve">统计的日期、输入范围和失败分类均可回溯至快照。1,038 条处理完成说明管线具备实际材料处理能力；字段准确性以明确 Gold、指标 profile 和匹配边界下的本地结果表述。该区分使评委可以分别核查系统能力、数据质量和算法效果。</w:t>
       </w:r>
     </w:p>
     <w:sectPr>
       <w:footerReference w:type="default" r:id="rId9"/>
       <w:pgSz w:w="11906" w:h="16838"/>
-      <w:pgMar w:top="1077" w:right="1134" w:bottom="1077" w:left="1134" w:header="720" w:footer="510" w:gutter="0"/>
+      <w:pgMar w:top="1361" w:right="1474" w:bottom="1247" w:left="1474" w:header="720" w:footer="680" w:gutter="0"/>
       <w:cols w:space="720"/>
       <w:docGrid w:linePitch="360"/>
     </w:sectPr>
@@ -1397,16 +2335,46 @@
   <w:p>
     <w:pPr>
       <w:pStyle w:val="Footer"/>
-      <w:jc w:val="right"/>
+      <w:keepNext w:val="0"/>
+      <w:spacing w:before="0" w:after="0" w:line="240" w:lineRule="auto"/>
+      <w:jc w:val="center"/>
+      <w:pBdr>
+        <w:top w:val="single" w:sz="4" w:space="4" w:color="D6DCE5"/>
+      </w:pBdr>
     </w:pPr>
+    <w:r/>
     <w:r>
       <w:rPr>
-        <w:color w:val="657184"/>
+        <w:rFonts w:ascii="Microsoft YaHei" w:hAnsi="Microsoft YaHei" w:eastAsia="Microsoft YaHei" w:cs="Microsoft YaHei"/>
+        <w:b w:val="0"/>
+        <w:i w:val="0"/>
+        <w:color w:val="8B97A8"/>
         <w:sz w:val="16"/>
       </w:rPr>
-      <w:t xml:space="preserve">招采数据智能分析引擎  |  </w:t>
+      <w:t>招采数据智能分析引擎 · 数据质量分析报告</w:t>
     </w:r>
-    <w:fldSimple w:instr="PAGE"/>
+    <w:r>
+      <w:rPr>
+        <w:rFonts w:ascii="Microsoft YaHei" w:hAnsi="Microsoft YaHei" w:eastAsia="Microsoft YaHei" w:cs="Microsoft YaHei"/>
+        <w:b w:val="0"/>
+        <w:i w:val="0"/>
+        <w:color w:val="8B97A8"/>
+        <w:sz w:val="16"/>
+      </w:rPr>
+      <w:t xml:space="preserve">        </w:t>
+    </w:r>
+    <w:r>
+      <w:rPr>
+        <w:rFonts w:ascii="Microsoft YaHei" w:hAnsi="Microsoft YaHei" w:eastAsia="Microsoft YaHei" w:cs="Microsoft YaHei"/>
+        <w:b w:val="0"/>
+        <w:i w:val="0"/>
+        <w:color w:val="8B97A8"/>
+        <w:sz w:val="16"/>
+      </w:rPr>
+      <w:fldChar w:fldCharType="begin"/>
+      <w:instrText xml:space="preserve">PAGE</w:instrText>
+      <w:fldChar w:fldCharType="end"/>
+    </w:r>
   </w:p>
 </w:ftr>
 </file>
@@ -1775,15 +2743,12 @@
     <w:qFormat/>
     <w:rsid w:val="00FC693F"/>
     <w:pPr>
-      <w:spacing w:line="283" w:lineRule="auto" w:after="120"/>
+      <w:spacing w:line="360" w:lineRule="auto"/>
     </w:pPr>
     <w:rPr>
-      <w:rFonts w:ascii="Aptos" w:hAnsi="Aptos" w:eastAsia="Microsoft YaHei"/>
-      <w:b w:val="0"/>
-      <w:i w:val="0"/>
-      <w:color w:val="222222"/>
+      <w:rFonts w:ascii="Microsoft YaHei" w:hAnsi="Microsoft YaHei" w:eastAsia="Microsoft YaHei"/>
+      <w:color w:val="1A2230"/>
       <w:sz w:val="21"/>
-      <w:u w:val="none"/>
     </w:rPr>
   </w:style>
   <w:style w:type="paragraph" w:styleId="Header">
@@ -1841,18 +2806,16 @@
     <w:pPr>
       <w:keepNext/>
       <w:keepLines/>
-      <w:spacing w:before="240" w:after="180"/>
+      <w:spacing w:before="480" w:after="0"/>
       <w:outlineLvl w:val="0"/>
     </w:pPr>
     <w:rPr>
-      <w:rFonts w:asciiTheme="majorHAnsi" w:eastAsiaTheme="majorEastAsia" w:hAnsiTheme="majorHAnsi" w:cstheme="majorBidi" w:ascii="Aptos" w:hAnsi="Aptos" w:eastAsia="Microsoft YaHei"/>
+      <w:rFonts w:asciiTheme="majorHAnsi" w:eastAsiaTheme="majorEastAsia" w:hAnsiTheme="majorHAnsi" w:cstheme="majorBidi"/>
       <w:b/>
       <w:bCs/>
-      <w:i w:val="0"/>
-      <w:color w:val="183B56"/>
-      <w:sz w:val="29"/>
+      <w:color w:val="365F91" w:themeColor="accent1" w:themeShade="BF"/>
+      <w:sz w:val="28"/>
       <w:szCs w:val="28"/>
-      <w:u w:val="none"/>
     </w:rPr>
   </w:style>
   <w:style w:type="paragraph" w:styleId="Heading2">
@@ -1871,14 +2834,12 @@
       <w:outlineLvl w:val="1"/>
     </w:pPr>
     <w:rPr>
-      <w:rFonts w:asciiTheme="majorHAnsi" w:eastAsiaTheme="majorEastAsia" w:hAnsiTheme="majorHAnsi" w:cstheme="majorBidi" w:ascii="Aptos" w:hAnsi="Aptos" w:eastAsia="Microsoft YaHei"/>
+      <w:rFonts w:asciiTheme="majorHAnsi" w:eastAsiaTheme="majorEastAsia" w:hAnsiTheme="majorHAnsi" w:cstheme="majorBidi"/>
       <w:b/>
       <w:bCs/>
-      <w:i w:val="0"/>
-      <w:color w:val="183B56"/>
-      <w:sz w:val="24"/>
+      <w:color w:val="4F81BD" w:themeColor="accent1"/>
+      <w:sz w:val="26"/>
       <w:szCs w:val="26"/>
-      <w:u w:val="none"/>
     </w:rPr>
   </w:style>
   <w:style w:type="paragraph" w:styleId="Heading3">
@@ -2131,20 +3092,19 @@
     <w:qFormat/>
     <w:rsid w:val="00FC693F"/>
     <w:pPr>
-      <w:keepNext/>
-      <w:spacing w:after="280" w:line="240" w:lineRule="auto"/>
+      <w:pBdr>
+        <w:bottom w:val="single" w:sz="8" w:space="4" w:color="4F81BD" w:themeColor="accent1"/>
+      </w:pBdr>
+      <w:spacing w:after="300" w:line="240" w:lineRule="auto"/>
       <w:contextualSpacing/>
     </w:pPr>
     <w:rPr>
-      <w:rFonts w:asciiTheme="majorHAnsi" w:eastAsiaTheme="majorEastAsia" w:hAnsiTheme="majorHAnsi" w:cstheme="majorBidi" w:ascii="Aptos" w:hAnsi="Aptos" w:eastAsia="Microsoft YaHei"/>
-      <w:b/>
-      <w:i w:val="0"/>
-      <w:color w:val="000000"/>
+      <w:rFonts w:asciiTheme="majorHAnsi" w:eastAsiaTheme="majorEastAsia" w:hAnsiTheme="majorHAnsi" w:cstheme="majorBidi"/>
+      <w:color w:val="17365D" w:themeColor="text2" w:themeShade="BF"/>
       <w:spacing w:val="5"/>
       <w:kern w:val="28"/>
-      <w:sz w:val="46"/>
+      <w:sz w:val="52"/>
       <w:szCs w:val="52"/>
-      <w:u w:val="none"/>
     </w:rPr>
   </w:style>
   <w:style w:type="character" w:customStyle="1" w:styleId="TitleChar">
@@ -2171,22 +3131,18 @@
     <w:qFormat/>
     <w:rsid w:val="00FC693F"/>
     <w:pPr>
-      <w:keepNext/>
       <w:numPr>
         <w:ilvl w:val="1"/>
       </w:numPr>
-      <w:spacing w:after="340"/>
     </w:pPr>
     <w:rPr>
-      <w:rFonts w:asciiTheme="majorHAnsi" w:eastAsiaTheme="majorEastAsia" w:hAnsiTheme="majorHAnsi" w:cstheme="majorBidi" w:ascii="Aptos" w:hAnsi="Aptos" w:eastAsia="Microsoft YaHei"/>
-      <w:b w:val="0"/>
-      <w:i w:val="0"/>
+      <w:rFonts w:asciiTheme="majorHAnsi" w:eastAsiaTheme="majorEastAsia" w:hAnsiTheme="majorHAnsi" w:cstheme="majorBidi"/>
+      <w:i/>
       <w:iCs/>
-      <w:color w:val="657184"/>
+      <w:color w:val="4F81BD" w:themeColor="accent1"/>
       <w:spacing w:val="15"/>
-      <w:sz w:val="19"/>
+      <w:sz w:val="24"/>
       <w:szCs w:val="24"/>
-      <w:u w:val="none"/>
     </w:rPr>
   </w:style>
   <w:style w:type="character" w:customStyle="1" w:styleId="SubtitleChar">
@@ -2623,6 +3579,9 @@
     <w:qFormat/>
     <w:rsid w:val="00FC693F"/>
     <w:pPr>
+      <w:pBdr>
+        <w:bottom w:val="single" w:sz="4" w:space="4" w:color="4F81BD" w:themeColor="accent1"/>
+      </w:pBdr>
       <w:spacing w:before="200" w:after="280"/>
       <w:ind w:left="936" w:right="936"/>
     </w:pPr>

</xml_diff>